<commit_message>
docs: add VSC handoff migration plan
</commit_message>
<xml_diff>
--- a/docs/ATE_Command_List_for_Test_Program.docx
+++ b/docs/ATE_Command_List_for_Test_Program.docx
@@ -74,16 +74,8 @@
         <w:rPr>
           <w:rFonts w:ascii="Meiryo UI" w:eastAsia="Meiryo UI" w:hAnsi="Meiryo UI" w:hint="eastAsia"/>
         </w:rPr>
-        <w:t xml:space="preserve">1. </w:t>
+        <w:t>1. 目的</w:t>
       </w:r>
-      <w:proofErr w:type="spellStart"/>
-      <w:r>
-        <w:rPr>
-          <w:rFonts w:ascii="Meiryo UI" w:eastAsia="Meiryo UI" w:hAnsi="Meiryo UI" w:hint="eastAsia"/>
-        </w:rPr>
-        <w:t>目的</w:t>
-      </w:r>
-      <w:proofErr w:type="spellEnd"/>
     </w:p>
     <w:p>
       <w:pPr>
@@ -128,16 +120,8 @@
         <w:rPr>
           <w:rFonts w:ascii="Meiryo UI" w:eastAsia="Meiryo UI" w:hAnsi="Meiryo UI" w:hint="eastAsia"/>
         </w:rPr>
-        <w:t xml:space="preserve">2. </w:t>
+        <w:t>2. 適用範囲と注意</w:t>
       </w:r>
-      <w:proofErr w:type="spellStart"/>
-      <w:r>
-        <w:rPr>
-          <w:rFonts w:ascii="Meiryo UI" w:eastAsia="Meiryo UI" w:hAnsi="Meiryo UI" w:hint="eastAsia"/>
-        </w:rPr>
-        <w:t>適用範囲と注意</w:t>
-      </w:r>
-      <w:proofErr w:type="spellEnd"/>
     </w:p>
     <w:p>
       <w:pPr>
@@ -147,37 +131,12 @@
           <w:rFonts w:ascii="Meiryo UI" w:eastAsia="Meiryo UI" w:hAnsi="Meiryo UI"/>
         </w:rPr>
       </w:pPr>
-      <w:proofErr w:type="spellStart"/>
       <w:r>
         <w:rPr>
           <w:rFonts w:ascii="Meiryo UI" w:eastAsia="Meiryo UI" w:hAnsi="Meiryo UI"/>
           <w:sz w:val="18"/>
         </w:rPr>
-        <w:t>本書は</w:t>
-      </w:r>
-      <w:proofErr w:type="spellEnd"/>
-      <w:r>
-        <w:rPr>
-          <w:rFonts w:ascii="Meiryo UI" w:eastAsia="Meiryo UI" w:hAnsi="Meiryo UI"/>
-          <w:sz w:val="18"/>
-        </w:rPr>
-        <w:t xml:space="preserve"> docs/ATE_Command_Master.md Rev.0 </w:t>
-      </w:r>
-      <w:proofErr w:type="spellStart"/>
-      <w:r>
-        <w:rPr>
-          <w:rFonts w:ascii="Meiryo UI" w:eastAsia="Meiryo UI" w:hAnsi="Meiryo UI"/>
-          <w:sz w:val="18"/>
-        </w:rPr>
-        <w:t>を元にした試験プログラム作成者向け一覧である</w:t>
-      </w:r>
-      <w:proofErr w:type="spellEnd"/>
-      <w:r>
-        <w:rPr>
-          <w:rFonts w:ascii="Meiryo UI" w:eastAsia="Meiryo UI" w:hAnsi="Meiryo UI"/>
-          <w:sz w:val="18"/>
-        </w:rPr>
-        <w:t>。</w:t>
+        <w:t>本書は docs/ATE_Command_Master.md Rev.0 を元にした試験プログラム作成者向け一覧である。</w:t>
       </w:r>
     </w:p>
     <w:p>
@@ -211,39 +170,7 @@
           <w:rFonts w:ascii="Meiryo UI" w:eastAsia="Meiryo UI" w:hAnsi="Meiryo UI"/>
           <w:sz w:val="18"/>
         </w:rPr>
-        <w:t xml:space="preserve">Refresh </w:t>
-      </w:r>
-      <w:proofErr w:type="spellStart"/>
-      <w:r>
-        <w:rPr>
-          <w:rFonts w:ascii="Meiryo UI" w:eastAsia="Meiryo UI" w:hAnsi="Meiryo UI"/>
-          <w:sz w:val="18"/>
-        </w:rPr>
-        <w:t>系、Control</w:t>
-      </w:r>
-      <w:proofErr w:type="spellEnd"/>
-      <w:r>
-        <w:rPr>
-          <w:rFonts w:ascii="Meiryo UI" w:eastAsia="Meiryo UI" w:hAnsi="Meiryo UI"/>
-          <w:sz w:val="18"/>
-        </w:rPr>
-        <w:t xml:space="preserve">/Set/Clear </w:t>
-      </w:r>
-      <w:proofErr w:type="spellStart"/>
-      <w:r>
-        <w:rPr>
-          <w:rFonts w:ascii="Meiryo UI" w:eastAsia="Meiryo UI" w:hAnsi="Meiryo UI"/>
-          <w:sz w:val="18"/>
-        </w:rPr>
-        <w:t>系は</w:t>
-      </w:r>
-      <w:proofErr w:type="spellEnd"/>
-      <w:r>
-        <w:rPr>
-          <w:rFonts w:ascii="Meiryo UI" w:eastAsia="Meiryo UI" w:hAnsi="Meiryo UI"/>
-          <w:sz w:val="18"/>
-        </w:rPr>
-        <w:t xml:space="preserve"> NF55G Transaction を発生させる。</w:t>
+        <w:t>Refresh 系、Control/Set/Clear 系は NF55G Transaction を発生させる。</w:t>
       </w:r>
     </w:p>
     <w:p>
@@ -333,16 +260,8 @@
         <w:rPr>
           <w:rFonts w:ascii="Meiryo UI" w:eastAsia="Meiryo UI" w:hAnsi="Meiryo UI" w:hint="eastAsia"/>
         </w:rPr>
-        <w:t xml:space="preserve">3. </w:t>
+        <w:t>3. 共通応答</w:t>
       </w:r>
-      <w:proofErr w:type="spellStart"/>
-      <w:r>
-        <w:rPr>
-          <w:rFonts w:ascii="Meiryo UI" w:eastAsia="Meiryo UI" w:hAnsi="Meiryo UI" w:hint="eastAsia"/>
-        </w:rPr>
-        <w:t>共通応答</w:t>
-      </w:r>
-      <w:proofErr w:type="spellEnd"/>
     </w:p>
     <w:tbl>
       <w:tblPr>
@@ -379,7 +298,6 @@
                 <w:rFonts w:ascii="Meiryo UI" w:eastAsia="Meiryo UI" w:hAnsi="Meiryo UI"/>
               </w:rPr>
             </w:pPr>
-            <w:proofErr w:type="spellStart"/>
             <w:r>
               <w:rPr>
                 <w:rFonts w:ascii="Meiryo UI" w:eastAsia="Meiryo UI" w:hAnsi="Meiryo UI"/>
@@ -388,7 +306,6 @@
               </w:rPr>
               <w:t>条件</w:t>
             </w:r>
-            <w:proofErr w:type="spellEnd"/>
           </w:p>
         </w:tc>
         <w:tc>
@@ -409,18 +326,8 @@
                 <w:b/>
                 <w:sz w:val="16"/>
               </w:rPr>
-              <w:t xml:space="preserve">ATE </w:t>
-            </w:r>
-            <w:proofErr w:type="spellStart"/>
-            <w:r>
-              <w:rPr>
-                <w:rFonts w:ascii="Meiryo UI" w:eastAsia="Meiryo UI" w:hAnsi="Meiryo UI"/>
-                <w:b/>
-                <w:sz w:val="16"/>
-              </w:rPr>
-              <w:t>応答</w:t>
-            </w:r>
-            <w:proofErr w:type="spellEnd"/>
+              <w:t>ATE 応答</w:t>
+            </w:r>
           </w:p>
         </w:tc>
         <w:tc>
@@ -435,7 +342,6 @@
                 <w:rFonts w:ascii="Meiryo UI" w:eastAsia="Meiryo UI" w:hAnsi="Meiryo UI"/>
               </w:rPr>
             </w:pPr>
-            <w:proofErr w:type="spellStart"/>
             <w:r>
               <w:rPr>
                 <w:rFonts w:ascii="Meiryo UI" w:eastAsia="Meiryo UI" w:hAnsi="Meiryo UI"/>
@@ -444,7 +350,6 @@
               </w:rPr>
               <w:t>備考</w:t>
             </w:r>
-            <w:proofErr w:type="spellEnd"/>
           </w:p>
         </w:tc>
       </w:tr>
@@ -468,17 +373,8 @@
                 <w:rFonts w:ascii="Meiryo UI" w:eastAsia="Meiryo UI" w:hAnsi="Meiryo UI"/>
                 <w:sz w:val="16"/>
               </w:rPr>
-              <w:t xml:space="preserve">Refresh </w:t>
-            </w:r>
-            <w:proofErr w:type="spellStart"/>
-            <w:r>
-              <w:rPr>
-                <w:rFonts w:ascii="Meiryo UI" w:eastAsia="Meiryo UI" w:hAnsi="Meiryo UI"/>
-                <w:sz w:val="16"/>
-              </w:rPr>
-              <w:t>成功</w:t>
-            </w:r>
-            <w:proofErr w:type="spellEnd"/>
+              <w:t>Refresh 成功</w:t>
+            </w:r>
           </w:p>
         </w:tc>
         <w:tc>
@@ -514,34 +410,14 @@
                 <w:lang w:eastAsia="ja-JP"/>
               </w:rPr>
             </w:pPr>
-            <w:proofErr w:type="spellStart"/>
             <w:r>
               <w:rPr>
                 <w:rFonts w:ascii="Meiryo UI" w:eastAsia="Meiryo UI" w:hAnsi="Meiryo UI" w:hint="eastAsia"/>
                 <w:sz w:val="16"/>
                 <w:szCs w:val="16"/>
               </w:rPr>
-              <w:t>対象</w:t>
-            </w:r>
-            <w:proofErr w:type="spellEnd"/>
-            <w:r>
-              <w:rPr>
-                <w:rFonts w:ascii="Meiryo UI" w:eastAsia="Meiryo UI" w:hAnsi="Meiryo UI" w:hint="eastAsia"/>
-                <w:sz w:val="16"/>
-                <w:szCs w:val="16"/>
-              </w:rPr>
-              <w:t xml:space="preserve"> Cache が VALID </w:t>
-            </w:r>
-            <w:proofErr w:type="spellStart"/>
-            <w:r>
-              <w:rPr>
-                <w:rFonts w:ascii="Meiryo UI" w:eastAsia="Meiryo UI" w:hAnsi="Meiryo UI" w:hint="eastAsia"/>
-                <w:sz w:val="16"/>
-                <w:szCs w:val="16"/>
-              </w:rPr>
-              <w:t>になる</w:t>
-            </w:r>
-            <w:proofErr w:type="spellEnd"/>
+              <w:t>対象 Cache が VALID になる</w:t>
+            </w:r>
           </w:p>
         </w:tc>
       </w:tr>
@@ -565,17 +441,8 @@
                 <w:rFonts w:ascii="Meiryo UI" w:eastAsia="Meiryo UI" w:hAnsi="Meiryo UI"/>
                 <w:sz w:val="16"/>
               </w:rPr>
-              <w:t xml:space="preserve">Control/Set/Clear </w:t>
-            </w:r>
-            <w:proofErr w:type="spellStart"/>
-            <w:r>
-              <w:rPr>
-                <w:rFonts w:ascii="Meiryo UI" w:eastAsia="Meiryo UI" w:hAnsi="Meiryo UI"/>
-                <w:sz w:val="16"/>
-              </w:rPr>
-              <w:t>成功</w:t>
-            </w:r>
-            <w:proofErr w:type="spellEnd"/>
+              <w:t>Control/Set/Clear 成功</w:t>
+            </w:r>
           </w:p>
         </w:tc>
         <w:tc>
@@ -643,17 +510,8 @@
                 <w:rFonts w:ascii="Meiryo UI" w:eastAsia="Meiryo UI" w:hAnsi="Meiryo UI"/>
                 <w:sz w:val="16"/>
               </w:rPr>
-              <w:t xml:space="preserve">Query </w:t>
-            </w:r>
-            <w:proofErr w:type="spellStart"/>
-            <w:r>
-              <w:rPr>
-                <w:rFonts w:ascii="Meiryo UI" w:eastAsia="Meiryo UI" w:hAnsi="Meiryo UI"/>
-                <w:sz w:val="16"/>
-              </w:rPr>
-              <w:t>成功</w:t>
-            </w:r>
-            <w:proofErr w:type="spellEnd"/>
+              <w:t>Query 成功</w:t>
+            </w:r>
           </w:p>
         </w:tc>
         <w:tc>
@@ -689,41 +547,13 @@
                 <w:lang w:eastAsia="ja-JP"/>
               </w:rPr>
             </w:pPr>
-            <w:proofErr w:type="spellStart"/>
             <w:r>
               <w:rPr>
                 <w:rFonts w:ascii="Meiryo UI" w:eastAsia="Meiryo UI" w:hAnsi="Meiryo UI" w:hint="eastAsia"/>
                 <w:sz w:val="16"/>
                 <w:szCs w:val="16"/>
               </w:rPr>
-              <w:t>半角</w:t>
-            </w:r>
-            <w:proofErr w:type="spellEnd"/>
-            <w:r>
-              <w:rPr>
-                <w:rFonts w:ascii="Meiryo UI" w:eastAsia="Meiryo UI" w:hAnsi="Meiryo UI" w:hint="eastAsia"/>
-                <w:sz w:val="16"/>
-                <w:szCs w:val="16"/>
-              </w:rPr>
-              <w:t xml:space="preserve"> ASCII 英数字、10 </w:t>
-            </w:r>
-            <w:proofErr w:type="spellStart"/>
-            <w:r>
-              <w:rPr>
-                <w:rFonts w:ascii="Meiryo UI" w:eastAsia="Meiryo UI" w:hAnsi="Meiryo UI" w:hint="eastAsia"/>
-                <w:sz w:val="16"/>
-                <w:szCs w:val="16"/>
-              </w:rPr>
-              <w:t>進数値、または</w:t>
-            </w:r>
-            <w:proofErr w:type="spellEnd"/>
-            <w:r>
-              <w:rPr>
-                <w:rFonts w:ascii="Meiryo UI" w:eastAsia="Meiryo UI" w:hAnsi="Meiryo UI" w:hint="eastAsia"/>
-                <w:sz w:val="16"/>
-                <w:szCs w:val="16"/>
-              </w:rPr>
-              <w:t xml:space="preserve"> FD の 64 ASCII HEX</w:t>
+              <w:t>半角 ASCII 英数字、10 進数値、または FD の 64 ASCII HEX</w:t>
             </w:r>
           </w:p>
         </w:tc>
@@ -748,23 +578,7 @@
                 <w:rFonts w:ascii="Meiryo UI" w:eastAsia="Meiryo UI" w:hAnsi="Meiryo UI"/>
                 <w:sz w:val="16"/>
               </w:rPr>
-              <w:t xml:space="preserve">Query </w:t>
-            </w:r>
-            <w:proofErr w:type="spellStart"/>
-            <w:r>
-              <w:rPr>
-                <w:rFonts w:ascii="Meiryo UI" w:eastAsia="Meiryo UI" w:hAnsi="Meiryo UI"/>
-                <w:sz w:val="16"/>
-              </w:rPr>
-              <w:t>対象</w:t>
-            </w:r>
-            <w:proofErr w:type="spellEnd"/>
-            <w:r>
-              <w:rPr>
-                <w:rFonts w:ascii="Meiryo UI" w:eastAsia="Meiryo UI" w:hAnsi="Meiryo UI"/>
-                <w:sz w:val="16"/>
-              </w:rPr>
-              <w:t xml:space="preserve"> Cache INVALID</w:t>
+              <w:t>Query 対象 Cache INVALID</w:t>
             </w:r>
           </w:p>
         </w:tc>
@@ -801,52 +615,14 @@
                 <w:lang w:eastAsia="ja-JP"/>
               </w:rPr>
             </w:pPr>
-            <w:proofErr w:type="spellStart"/>
             <w:r>
               <w:rPr>
                 <w:rFonts w:ascii="Meiryo UI" w:eastAsia="Meiryo UI" w:hAnsi="Meiryo UI" w:hint="eastAsia"/>
                 <w:sz w:val="16"/>
                 <w:szCs w:val="16"/>
               </w:rPr>
-              <w:t>個別</w:t>
-            </w:r>
-            <w:proofErr w:type="spellEnd"/>
-            <w:r>
-              <w:rPr>
-                <w:rFonts w:ascii="Meiryo UI" w:eastAsia="Meiryo UI" w:hAnsi="Meiryo UI" w:hint="eastAsia"/>
-                <w:sz w:val="16"/>
-                <w:szCs w:val="16"/>
-              </w:rPr>
-              <w:t xml:space="preserve"> Query </w:t>
-            </w:r>
-            <w:proofErr w:type="spellStart"/>
-            <w:r>
-              <w:rPr>
-                <w:rFonts w:ascii="Meiryo UI" w:eastAsia="Meiryo UI" w:hAnsi="Meiryo UI" w:hint="eastAsia"/>
-                <w:sz w:val="16"/>
-                <w:szCs w:val="16"/>
-              </w:rPr>
-              <w:t>から自動</w:t>
-            </w:r>
-            <w:proofErr w:type="spellEnd"/>
-            <w:r>
-              <w:rPr>
-                <w:rFonts w:ascii="Meiryo UI" w:eastAsia="Meiryo UI" w:hAnsi="Meiryo UI" w:hint="eastAsia"/>
-                <w:sz w:val="16"/>
-                <w:szCs w:val="16"/>
-              </w:rPr>
-              <w:t xml:space="preserve"> Refresh </w:t>
-            </w:r>
-            <w:proofErr w:type="spellStart"/>
-            <w:r>
-              <w:rPr>
-                <w:rFonts w:ascii="Meiryo UI" w:eastAsia="Meiryo UI" w:hAnsi="Meiryo UI" w:hint="eastAsia"/>
-                <w:sz w:val="16"/>
-                <w:szCs w:val="16"/>
-              </w:rPr>
-              <w:t>しない</w:t>
-            </w:r>
-            <w:proofErr w:type="spellEnd"/>
+              <w:t>個別 Query から自動 Refresh しない</w:t>
+            </w:r>
           </w:p>
         </w:tc>
       </w:tr>
@@ -870,23 +646,7 @@
                 <w:rFonts w:ascii="Meiryo UI" w:eastAsia="Meiryo UI" w:hAnsi="Meiryo UI"/>
                 <w:sz w:val="16"/>
               </w:rPr>
-              <w:t>Parser/</w:t>
-            </w:r>
-            <w:proofErr w:type="spellStart"/>
-            <w:r>
-              <w:rPr>
-                <w:rFonts w:ascii="Meiryo UI" w:eastAsia="Meiryo UI" w:hAnsi="Meiryo UI"/>
-                <w:sz w:val="16"/>
-              </w:rPr>
-              <w:t>形式エラ</w:t>
-            </w:r>
-            <w:proofErr w:type="spellEnd"/>
-            <w:r>
-              <w:rPr>
-                <w:rFonts w:ascii="Meiryo UI" w:eastAsia="Meiryo UI" w:hAnsi="Meiryo UI"/>
-                <w:sz w:val="16"/>
-              </w:rPr>
-              <w:t>ー</w:t>
+              <w:t>Parser/形式エラー</w:t>
             </w:r>
           </w:p>
         </w:tc>
@@ -955,17 +715,8 @@
                 <w:rFonts w:ascii="Meiryo UI" w:eastAsia="Meiryo UI" w:hAnsi="Meiryo UI"/>
                 <w:sz w:val="16"/>
               </w:rPr>
-              <w:t xml:space="preserve">NF55G </w:t>
-            </w:r>
-            <w:proofErr w:type="spellStart"/>
-            <w:r>
-              <w:rPr>
-                <w:rFonts w:ascii="Meiryo UI" w:eastAsia="Meiryo UI" w:hAnsi="Meiryo UI"/>
-                <w:sz w:val="16"/>
-              </w:rPr>
-              <w:t>エラー応答</w:t>
-            </w:r>
-            <w:proofErr w:type="spellEnd"/>
+              <w:t>NF55G エラー応答</w:t>
+            </w:r>
           </w:p>
         </w:tc>
         <w:tc>
@@ -1007,18 +758,8 @@
                 <w:sz w:val="16"/>
                 <w:szCs w:val="16"/>
               </w:rPr>
-              <w:t xml:space="preserve">D6 error response を ATE </w:t>
-            </w:r>
-            <w:proofErr w:type="spellStart"/>
-            <w:r>
-              <w:rPr>
-                <w:rFonts w:ascii="Meiryo UI" w:eastAsia="Meiryo UI" w:hAnsi="Meiryo UI" w:hint="eastAsia"/>
-                <w:sz w:val="16"/>
-                <w:szCs w:val="16"/>
-              </w:rPr>
-              <w:t>へ返す</w:t>
-            </w:r>
-            <w:proofErr w:type="spellEnd"/>
+              <w:t>D6 error response を ATE へ返す</w:t>
+            </w:r>
           </w:p>
         </w:tc>
       </w:tr>
@@ -1079,68 +820,30 @@
                 <w:lang w:eastAsia="ja-JP"/>
               </w:rPr>
             </w:pPr>
-            <w:proofErr w:type="spellStart"/>
             <w:r>
               <w:rPr>
                 <w:rFonts w:ascii="Meiryo UI" w:eastAsia="Meiryo UI" w:hAnsi="Meiryo UI" w:hint="eastAsia"/>
                 <w:sz w:val="16"/>
                 <w:szCs w:val="16"/>
               </w:rPr>
-              <w:t>実行成否不明時は</w:t>
-            </w:r>
-            <w:proofErr w:type="spellEnd"/>
+              <w:t xml:space="preserve">実行成否不明時は </w:t>
+            </w:r>
+            <w:r>
+              <w:rPr>
+                <w:rFonts w:ascii="Meiryo UI" w:eastAsia="Meiryo UI" w:hAnsi="Meiryo UI"/>
+                <w:sz w:val="16"/>
+                <w:szCs w:val="16"/>
+              </w:rPr>
+              <w:t>ambiguous=True</w:t>
+            </w:r>
             <w:r>
               <w:rPr>
                 <w:rFonts w:ascii="Meiryo UI" w:eastAsia="Meiryo UI" w:hAnsi="Meiryo UI" w:hint="eastAsia"/>
                 <w:sz w:val="16"/>
                 <w:szCs w:val="16"/>
               </w:rPr>
-              <w:t xml:space="preserve"> </w:t>
-            </w:r>
-            <w:r>
-              <w:rPr>
-                <w:rFonts w:ascii="Meiryo UI" w:eastAsia="Meiryo UI" w:hAnsi="Meiryo UI"/>
-                <w:sz w:val="16"/>
-                <w:szCs w:val="16"/>
-              </w:rPr>
-              <w:t>ambiguous=True</w:t>
-            </w:r>
-            <w:r>
-              <w:rPr>
-                <w:rFonts w:ascii="Meiryo UI" w:eastAsia="Meiryo UI" w:hAnsi="Meiryo UI" w:hint="eastAsia"/>
-                <w:sz w:val="16"/>
-                <w:szCs w:val="16"/>
-              </w:rPr>
-              <w:t xml:space="preserve"> </w:t>
-            </w:r>
-            <w:proofErr w:type="spellStart"/>
-            <w:r>
-              <w:rPr>
-                <w:rFonts w:ascii="Meiryo UI" w:eastAsia="Meiryo UI" w:hAnsi="Meiryo UI" w:hint="eastAsia"/>
-                <w:sz w:val="16"/>
-                <w:szCs w:val="16"/>
-              </w:rPr>
-              <w:t>とし、関連</w:t>
-            </w:r>
-            <w:proofErr w:type="spellEnd"/>
-            <w:r>
-              <w:rPr>
-                <w:rFonts w:ascii="Meiryo UI" w:eastAsia="Meiryo UI" w:hAnsi="Meiryo UI" w:hint="eastAsia"/>
-                <w:sz w:val="16"/>
-                <w:szCs w:val="16"/>
-              </w:rPr>
-              <w:t xml:space="preserve"> Cache を INVALID </w:t>
-            </w:r>
-            <w:proofErr w:type="spellStart"/>
-            <w:r>
-              <w:rPr>
-                <w:rFonts w:ascii="Meiryo UI" w:eastAsia="Meiryo UI" w:hAnsi="Meiryo UI" w:hint="eastAsia"/>
-                <w:sz w:val="16"/>
-                <w:szCs w:val="16"/>
-              </w:rPr>
-              <w:t>にする</w:t>
-            </w:r>
-            <w:proofErr w:type="spellEnd"/>
+              <w:t xml:space="preserve"> とし、関連 Cache を INVALID にする</w:t>
+            </w:r>
           </w:p>
         </w:tc>
       </w:tr>
@@ -1286,16 +989,8 @@
           <w:rFonts w:ascii="Meiryo UI" w:eastAsia="Meiryo UI" w:hAnsi="Meiryo UI" w:hint="eastAsia"/>
         </w:rPr>
         <w:lastRenderedPageBreak/>
-        <w:t xml:space="preserve">4. Refresh / Read </w:t>
+        <w:t>4. Refresh / Read コマンド</w:t>
       </w:r>
-      <w:proofErr w:type="spellStart"/>
-      <w:r>
-        <w:rPr>
-          <w:rFonts w:ascii="Meiryo UI" w:eastAsia="Meiryo UI" w:hAnsi="Meiryo UI" w:hint="eastAsia"/>
-        </w:rPr>
-        <w:t>コマンド</w:t>
-      </w:r>
-      <w:proofErr w:type="spellEnd"/>
     </w:p>
     <w:tbl>
       <w:tblPr>
@@ -1356,21 +1051,8 @@
                 <w:sz w:val="16"/>
                 <w:szCs w:val="16"/>
               </w:rPr>
-              <w:t xml:space="preserve">ATE </w:t>
-            </w:r>
-            <w:proofErr w:type="spellStart"/>
-            <w:r>
-              <w:rPr>
-                <w:rFonts w:ascii="Meiryo UI" w:eastAsia="Meiryo UI" w:hAnsi="Meiryo UI" w:hint="eastAsia"/>
-                <w:b/>
-                <w:bCs/>
-                <w:color w:val="000000"/>
-                <w:sz w:val="16"/>
-                <w:szCs w:val="16"/>
-              </w:rPr>
-              <w:t>コマンド</w:t>
-            </w:r>
-            <w:proofErr w:type="spellEnd"/>
+              <w:t>ATE コマンド</w:t>
+            </w:r>
           </w:p>
         </w:tc>
         <w:tc>
@@ -1398,7 +1080,6 @@
                 <w:rFonts w:ascii="Meiryo UI" w:eastAsia="Meiryo UI" w:hAnsi="Meiryo UI"/>
               </w:rPr>
             </w:pPr>
-            <w:proofErr w:type="spellStart"/>
             <w:r>
               <w:rPr>
                 <w:rFonts w:ascii="Meiryo UI" w:eastAsia="Meiryo UI" w:hAnsi="Meiryo UI" w:hint="eastAsia"/>
@@ -1410,7 +1091,6 @@
               </w:rPr>
               <w:t>引数形式</w:t>
             </w:r>
-            <w:proofErr w:type="spellEnd"/>
           </w:p>
         </w:tc>
         <w:tc>
@@ -1561,21 +1241,8 @@
                 <w:sz w:val="16"/>
                 <w:szCs w:val="16"/>
               </w:rPr>
-              <w:t xml:space="preserve">NF55G </w:t>
-            </w:r>
-            <w:proofErr w:type="spellStart"/>
-            <w:r>
-              <w:rPr>
-                <w:rFonts w:ascii="Meiryo UI" w:eastAsia="Meiryo UI" w:hAnsi="Meiryo UI" w:hint="eastAsia"/>
-                <w:b/>
-                <w:bCs/>
-                <w:color w:val="000000"/>
-                <w:sz w:val="16"/>
-                <w:szCs w:val="16"/>
-              </w:rPr>
-              <w:t>通信</w:t>
-            </w:r>
-            <w:proofErr w:type="spellEnd"/>
+              <w:t>NF55G 通信</w:t>
+            </w:r>
           </w:p>
         </w:tc>
         <w:tc>
@@ -1603,7 +1270,6 @@
                 <w:rFonts w:ascii="Meiryo UI" w:eastAsia="Meiryo UI" w:hAnsi="Meiryo UI"/>
               </w:rPr>
             </w:pPr>
-            <w:proofErr w:type="spellStart"/>
             <w:r>
               <w:rPr>
                 <w:rFonts w:ascii="Meiryo UI" w:eastAsia="Meiryo UI" w:hAnsi="Meiryo UI" w:hint="eastAsia"/>
@@ -1613,19 +1279,7 @@
                 <w:sz w:val="16"/>
                 <w:szCs w:val="16"/>
               </w:rPr>
-              <w:t>成功時</w:t>
-            </w:r>
-            <w:proofErr w:type="spellEnd"/>
-            <w:r>
-              <w:rPr>
-                <w:rFonts w:ascii="Meiryo UI" w:eastAsia="Meiryo UI" w:hAnsi="Meiryo UI" w:hint="eastAsia"/>
-                <w:b/>
-                <w:bCs/>
-                <w:color w:val="000000"/>
-                <w:sz w:val="16"/>
-                <w:szCs w:val="16"/>
-              </w:rPr>
-              <w:t xml:space="preserve"> Cache</w:t>
+              <w:t>成功時 Cache</w:t>
             </w:r>
           </w:p>
         </w:tc>
@@ -1654,7 +1308,6 @@
                 <w:rFonts w:ascii="Meiryo UI" w:eastAsia="Meiryo UI" w:hAnsi="Meiryo UI"/>
               </w:rPr>
             </w:pPr>
-            <w:proofErr w:type="spellStart"/>
             <w:r>
               <w:rPr>
                 <w:rFonts w:ascii="Meiryo UI" w:eastAsia="Meiryo UI" w:hAnsi="Meiryo UI" w:hint="eastAsia"/>
@@ -1664,33 +1317,8 @@
                 <w:sz w:val="16"/>
                 <w:szCs w:val="16"/>
               </w:rPr>
-              <w:t>後続</w:t>
-            </w:r>
-            <w:proofErr w:type="spellEnd"/>
-            <w:r>
-              <w:rPr>
-                <w:rFonts w:ascii="Meiryo UI" w:eastAsia="Meiryo UI" w:hAnsi="Meiryo UI" w:hint="eastAsia"/>
-                <w:b/>
-                <w:bCs/>
-                <w:color w:val="000000"/>
-                <w:sz w:val="16"/>
-                <w:szCs w:val="16"/>
-              </w:rPr>
-              <w:t xml:space="preserve"> Query / </w:t>
-            </w:r>
-            <w:proofErr w:type="spellStart"/>
-            <w:r>
-              <w:rPr>
-                <w:rFonts w:ascii="Meiryo UI" w:eastAsia="Meiryo UI" w:hAnsi="Meiryo UI" w:hint="eastAsia"/>
-                <w:b/>
-                <w:bCs/>
-                <w:color w:val="000000"/>
-                <w:sz w:val="16"/>
-                <w:szCs w:val="16"/>
-              </w:rPr>
-              <w:t>確認</w:t>
-            </w:r>
-            <w:proofErr w:type="spellEnd"/>
+              <w:t>後続 Query / 確認</w:t>
+            </w:r>
           </w:p>
         </w:tc>
         <w:tc>
@@ -1718,7 +1346,6 @@
                 <w:rFonts w:ascii="Meiryo UI" w:eastAsia="Meiryo UI" w:hAnsi="Meiryo UI"/>
               </w:rPr>
             </w:pPr>
-            <w:proofErr w:type="spellStart"/>
             <w:r>
               <w:rPr>
                 <w:rFonts w:ascii="Meiryo UI" w:eastAsia="Meiryo UI" w:hAnsi="Meiryo UI" w:hint="eastAsia"/>
@@ -1730,7 +1357,6 @@
               </w:rPr>
               <w:t>注意</w:t>
             </w:r>
-            <w:proofErr w:type="spellEnd"/>
           </w:p>
         </w:tc>
       </w:tr>
@@ -1796,7 +1422,6 @@
                 <w:rFonts w:ascii="Meiryo UI" w:eastAsia="Meiryo UI" w:hAnsi="Meiryo UI"/>
               </w:rPr>
             </w:pPr>
-            <w:proofErr w:type="spellStart"/>
             <w:r>
               <w:rPr>
                 <w:rFonts w:ascii="Meiryo UI" w:eastAsia="Meiryo UI" w:hAnsi="Meiryo UI" w:hint="eastAsia"/>
@@ -1805,7 +1430,6 @@
               </w:rPr>
               <w:t>なし</w:t>
             </w:r>
-            <w:proofErr w:type="spellEnd"/>
           </w:p>
         </w:tc>
         <w:tc>
@@ -1866,7 +1490,6 @@
                 <w:rFonts w:ascii="Meiryo UI" w:eastAsia="Meiryo UI" w:hAnsi="Meiryo UI"/>
               </w:rPr>
             </w:pPr>
-            <w:proofErr w:type="spellStart"/>
             <w:r>
               <w:rPr>
                 <w:rFonts w:ascii="Meiryo UI" w:eastAsia="Meiryo UI" w:hAnsi="Meiryo UI" w:hint="eastAsia"/>
@@ -1875,7 +1498,6 @@
               </w:rPr>
               <w:t>なし</w:t>
             </w:r>
-            <w:proofErr w:type="spellEnd"/>
           </w:p>
         </w:tc>
         <w:tc>
@@ -1908,25 +1530,7 @@
                 <w:sz w:val="16"/>
                 <w:szCs w:val="16"/>
               </w:rPr>
-              <w:t xml:space="preserve">600 </w:t>
-            </w:r>
-            <w:proofErr w:type="spellStart"/>
-            <w:r>
-              <w:rPr>
-                <w:rFonts w:ascii="Meiryo UI" w:eastAsia="Meiryo UI" w:hAnsi="Meiryo UI" w:hint="eastAsia"/>
-                <w:sz w:val="16"/>
-                <w:szCs w:val="16"/>
-              </w:rPr>
-              <w:t>ms</w:t>
-            </w:r>
-            <w:proofErr w:type="spellEnd"/>
-            <w:r>
-              <w:rPr>
-                <w:rFonts w:ascii="Meiryo UI" w:eastAsia="Meiryo UI" w:hAnsi="Meiryo UI" w:hint="eastAsia"/>
-                <w:sz w:val="16"/>
-                <w:szCs w:val="16"/>
-              </w:rPr>
-              <w:t xml:space="preserve"> provisional</w:t>
+              <w:t>600 ms provisional</w:t>
             </w:r>
           </w:p>
         </w:tc>
@@ -1954,7 +1558,6 @@
                 <w:rFonts w:ascii="Meiryo UI" w:eastAsia="Meiryo UI" w:hAnsi="Meiryo UI"/>
               </w:rPr>
             </w:pPr>
-            <w:proofErr w:type="spellStart"/>
             <w:r>
               <w:rPr>
                 <w:rFonts w:ascii="Meiryo UI" w:eastAsia="Meiryo UI" w:hAnsi="Meiryo UI" w:hint="eastAsia"/>
@@ -1963,7 +1566,6 @@
               </w:rPr>
               <w:t>あり</w:t>
             </w:r>
-            <w:proofErr w:type="spellEnd"/>
           </w:p>
         </w:tc>
         <w:tc>
@@ -2064,54 +1666,8 @@
                 <w:sz w:val="16"/>
                 <w:szCs w:val="16"/>
               </w:rPr>
-              <w:t xml:space="preserve">D0 </w:t>
-            </w:r>
-            <w:proofErr w:type="spellStart"/>
-            <w:r>
-              <w:rPr>
-                <w:rFonts w:ascii="Meiryo UI" w:eastAsia="Meiryo UI" w:hAnsi="Meiryo UI" w:hint="eastAsia"/>
-                <w:sz w:val="16"/>
-                <w:szCs w:val="16"/>
-              </w:rPr>
-              <w:t>内の</w:t>
-            </w:r>
-            <w:proofErr w:type="spellEnd"/>
-            <w:r>
-              <w:rPr>
-                <w:rFonts w:ascii="Meiryo UI" w:eastAsia="Meiryo UI" w:hAnsi="Meiryo UI" w:hint="eastAsia"/>
-                <w:sz w:val="16"/>
-                <w:szCs w:val="16"/>
-              </w:rPr>
-              <w:t xml:space="preserve"> STATUS/INFO </w:t>
-            </w:r>
-            <w:proofErr w:type="spellStart"/>
-            <w:r>
-              <w:rPr>
-                <w:rFonts w:ascii="Meiryo UI" w:eastAsia="Meiryo UI" w:hAnsi="Meiryo UI" w:hint="eastAsia"/>
-                <w:sz w:val="16"/>
-                <w:szCs w:val="16"/>
-              </w:rPr>
-              <w:t>は各</w:t>
-            </w:r>
-            <w:proofErr w:type="spellEnd"/>
-            <w:r>
-              <w:rPr>
-                <w:rFonts w:ascii="Meiryo UI" w:eastAsia="Meiryo UI" w:hAnsi="Meiryo UI" w:hint="eastAsia"/>
-                <w:sz w:val="16"/>
-                <w:szCs w:val="16"/>
-              </w:rPr>
-              <w:t xml:space="preserve"> Cache </w:t>
-            </w:r>
-            <w:proofErr w:type="spellStart"/>
-            <w:r>
-              <w:rPr>
-                <w:rFonts w:ascii="Meiryo UI" w:eastAsia="Meiryo UI" w:hAnsi="Meiryo UI" w:hint="eastAsia"/>
-                <w:sz w:val="16"/>
-                <w:szCs w:val="16"/>
-              </w:rPr>
-              <w:t>へ昇格しない</w:t>
-            </w:r>
-            <w:proofErr w:type="spellEnd"/>
+              <w:t>D0 内の STATUS/INFO は各 Cache へ昇格しない</w:t>
+            </w:r>
           </w:p>
         </w:tc>
       </w:tr>
@@ -2177,7 +1733,6 @@
                 <w:rFonts w:ascii="Meiryo UI" w:eastAsia="Meiryo UI" w:hAnsi="Meiryo UI"/>
               </w:rPr>
             </w:pPr>
-            <w:proofErr w:type="spellStart"/>
             <w:r>
               <w:rPr>
                 <w:rFonts w:ascii="Meiryo UI" w:eastAsia="Meiryo UI" w:hAnsi="Meiryo UI" w:hint="eastAsia"/>
@@ -2186,7 +1741,6 @@
               </w:rPr>
               <w:t>なし</w:t>
             </w:r>
-            <w:proofErr w:type="spellEnd"/>
           </w:p>
         </w:tc>
         <w:tc>
@@ -2247,7 +1801,6 @@
                 <w:rFonts w:ascii="Meiryo UI" w:eastAsia="Meiryo UI" w:hAnsi="Meiryo UI"/>
               </w:rPr>
             </w:pPr>
-            <w:proofErr w:type="spellStart"/>
             <w:r>
               <w:rPr>
                 <w:rFonts w:ascii="Meiryo UI" w:eastAsia="Meiryo UI" w:hAnsi="Meiryo UI" w:hint="eastAsia"/>
@@ -2256,7 +1809,6 @@
               </w:rPr>
               <w:t>なし</w:t>
             </w:r>
-            <w:proofErr w:type="spellEnd"/>
           </w:p>
         </w:tc>
         <w:tc>
@@ -2289,18 +1841,8 @@
                 <w:sz w:val="16"/>
                 <w:szCs w:val="16"/>
               </w:rPr>
-              <w:t xml:space="preserve">100 </w:t>
-            </w:r>
-            <w:proofErr w:type="spellStart"/>
-            <w:r>
-              <w:rPr>
-                <w:rFonts w:ascii="Meiryo UI" w:eastAsia="Meiryo UI" w:hAnsi="Meiryo UI" w:hint="eastAsia"/>
-                <w:sz w:val="16"/>
-                <w:szCs w:val="16"/>
-              </w:rPr>
-              <w:t>ms</w:t>
-            </w:r>
-            <w:proofErr w:type="spellEnd"/>
+              <w:t>100 ms</w:t>
+            </w:r>
           </w:p>
         </w:tc>
         <w:tc>
@@ -2327,7 +1869,6 @@
                 <w:rFonts w:ascii="Meiryo UI" w:eastAsia="Meiryo UI" w:hAnsi="Meiryo UI"/>
               </w:rPr>
             </w:pPr>
-            <w:proofErr w:type="spellStart"/>
             <w:r>
               <w:rPr>
                 <w:rFonts w:ascii="Meiryo UI" w:eastAsia="Meiryo UI" w:hAnsi="Meiryo UI" w:hint="eastAsia"/>
@@ -2336,7 +1877,6 @@
               </w:rPr>
               <w:t>あり</w:t>
             </w:r>
-            <w:proofErr w:type="spellEnd"/>
           </w:p>
         </w:tc>
         <w:tc>
@@ -2437,36 +1977,8 @@
                 <w:sz w:val="16"/>
                 <w:szCs w:val="16"/>
               </w:rPr>
-              <w:t xml:space="preserve">EB Event </w:t>
-            </w:r>
-            <w:proofErr w:type="spellStart"/>
-            <w:r>
-              <w:rPr>
-                <w:rFonts w:ascii="Meiryo UI" w:eastAsia="Meiryo UI" w:hAnsi="Meiryo UI" w:hint="eastAsia"/>
-                <w:sz w:val="16"/>
-                <w:szCs w:val="16"/>
-              </w:rPr>
-              <w:t>では</w:t>
-            </w:r>
-            <w:proofErr w:type="spellEnd"/>
-            <w:r>
-              <w:rPr>
-                <w:rFonts w:ascii="Meiryo UI" w:eastAsia="Meiryo UI" w:hAnsi="Meiryo UI" w:hint="eastAsia"/>
-                <w:sz w:val="16"/>
-                <w:szCs w:val="16"/>
-              </w:rPr>
-              <w:t xml:space="preserve"> STATUS Cache </w:t>
-            </w:r>
-            <w:proofErr w:type="spellStart"/>
-            <w:r>
-              <w:rPr>
-                <w:rFonts w:ascii="Meiryo UI" w:eastAsia="Meiryo UI" w:hAnsi="Meiryo UI" w:hint="eastAsia"/>
-                <w:sz w:val="16"/>
-                <w:szCs w:val="16"/>
-              </w:rPr>
-              <w:t>を更新しない</w:t>
-            </w:r>
-            <w:proofErr w:type="spellEnd"/>
+              <w:t>EB Event では STATUS Cache を更新しない</w:t>
+            </w:r>
           </w:p>
         </w:tc>
       </w:tr>
@@ -2532,7 +2044,6 @@
                 <w:rFonts w:ascii="Meiryo UI" w:eastAsia="Meiryo UI" w:hAnsi="Meiryo UI"/>
               </w:rPr>
             </w:pPr>
-            <w:proofErr w:type="spellStart"/>
             <w:r>
               <w:rPr>
                 <w:rFonts w:ascii="Meiryo UI" w:eastAsia="Meiryo UI" w:hAnsi="Meiryo UI" w:hint="eastAsia"/>
@@ -2541,7 +2052,6 @@
               </w:rPr>
               <w:t>なし</w:t>
             </w:r>
-            <w:proofErr w:type="spellEnd"/>
           </w:p>
         </w:tc>
         <w:tc>
@@ -2602,7 +2112,6 @@
                 <w:rFonts w:ascii="Meiryo UI" w:eastAsia="Meiryo UI" w:hAnsi="Meiryo UI"/>
               </w:rPr>
             </w:pPr>
-            <w:proofErr w:type="spellStart"/>
             <w:r>
               <w:rPr>
                 <w:rFonts w:ascii="Meiryo UI" w:eastAsia="Meiryo UI" w:hAnsi="Meiryo UI" w:hint="eastAsia"/>
@@ -2611,7 +2120,6 @@
               </w:rPr>
               <w:t>なし</w:t>
             </w:r>
-            <w:proofErr w:type="spellEnd"/>
           </w:p>
         </w:tc>
         <w:tc>
@@ -2644,18 +2152,8 @@
                 <w:sz w:val="16"/>
                 <w:szCs w:val="16"/>
               </w:rPr>
-              <w:t xml:space="preserve">100 </w:t>
-            </w:r>
-            <w:proofErr w:type="spellStart"/>
-            <w:r>
-              <w:rPr>
-                <w:rFonts w:ascii="Meiryo UI" w:eastAsia="Meiryo UI" w:hAnsi="Meiryo UI" w:hint="eastAsia"/>
-                <w:sz w:val="16"/>
-                <w:szCs w:val="16"/>
-              </w:rPr>
-              <w:t>ms</w:t>
-            </w:r>
-            <w:proofErr w:type="spellEnd"/>
+              <w:t>100 ms</w:t>
+            </w:r>
           </w:p>
         </w:tc>
         <w:tc>
@@ -2682,7 +2180,6 @@
                 <w:rFonts w:ascii="Meiryo UI" w:eastAsia="Meiryo UI" w:hAnsi="Meiryo UI"/>
               </w:rPr>
             </w:pPr>
-            <w:proofErr w:type="spellStart"/>
             <w:r>
               <w:rPr>
                 <w:rFonts w:ascii="Meiryo UI" w:eastAsia="Meiryo UI" w:hAnsi="Meiryo UI" w:hint="eastAsia"/>
@@ -2691,7 +2188,6 @@
               </w:rPr>
               <w:t>あり</w:t>
             </w:r>
-            <w:proofErr w:type="spellEnd"/>
           </w:p>
         </w:tc>
         <w:tc>
@@ -2859,7 +2355,6 @@
                 <w:rFonts w:ascii="Meiryo UI" w:eastAsia="Meiryo UI" w:hAnsi="Meiryo UI"/>
               </w:rPr>
             </w:pPr>
-            <w:proofErr w:type="spellStart"/>
             <w:r>
               <w:rPr>
                 <w:rFonts w:ascii="Meiryo UI" w:eastAsia="Meiryo UI" w:hAnsi="Meiryo UI" w:hint="eastAsia"/>
@@ -2868,7 +2363,6 @@
               </w:rPr>
               <w:t>なし</w:t>
             </w:r>
-            <w:proofErr w:type="spellEnd"/>
           </w:p>
         </w:tc>
         <w:tc>
@@ -2929,7 +2423,6 @@
                 <w:rFonts w:ascii="Meiryo UI" w:eastAsia="Meiryo UI" w:hAnsi="Meiryo UI"/>
               </w:rPr>
             </w:pPr>
-            <w:proofErr w:type="spellStart"/>
             <w:r>
               <w:rPr>
                 <w:rFonts w:ascii="Meiryo UI" w:eastAsia="Meiryo UI" w:hAnsi="Meiryo UI" w:hint="eastAsia"/>
@@ -2938,7 +2431,6 @@
               </w:rPr>
               <w:t>なし</w:t>
             </w:r>
-            <w:proofErr w:type="spellEnd"/>
           </w:p>
         </w:tc>
         <w:tc>
@@ -2971,18 +2463,8 @@
                 <w:sz w:val="16"/>
                 <w:szCs w:val="16"/>
               </w:rPr>
-              <w:t xml:space="preserve">100 </w:t>
-            </w:r>
-            <w:proofErr w:type="spellStart"/>
-            <w:r>
-              <w:rPr>
-                <w:rFonts w:ascii="Meiryo UI" w:eastAsia="Meiryo UI" w:hAnsi="Meiryo UI" w:hint="eastAsia"/>
-                <w:sz w:val="16"/>
-                <w:szCs w:val="16"/>
-              </w:rPr>
-              <w:t>ms</w:t>
-            </w:r>
-            <w:proofErr w:type="spellEnd"/>
+              <w:t>100 ms</w:t>
+            </w:r>
           </w:p>
         </w:tc>
         <w:tc>
@@ -3009,7 +2491,6 @@
                 <w:rFonts w:ascii="Meiryo UI" w:eastAsia="Meiryo UI" w:hAnsi="Meiryo UI"/>
               </w:rPr>
             </w:pPr>
-            <w:proofErr w:type="spellStart"/>
             <w:r>
               <w:rPr>
                 <w:rFonts w:ascii="Meiryo UI" w:eastAsia="Meiryo UI" w:hAnsi="Meiryo UI" w:hint="eastAsia"/>
@@ -3018,7 +2499,6 @@
               </w:rPr>
               <w:t>あり</w:t>
             </w:r>
-            <w:proofErr w:type="spellEnd"/>
           </w:p>
         </w:tc>
         <w:tc>
@@ -3085,18 +2565,8 @@
                 <w:sz w:val="16"/>
                 <w:szCs w:val="16"/>
               </w:rPr>
-              <w:t xml:space="preserve">D2 </w:t>
-            </w:r>
-            <w:proofErr w:type="spellStart"/>
-            <w:r>
-              <w:rPr>
-                <w:rFonts w:ascii="Meiryo UI" w:eastAsia="Meiryo UI" w:hAnsi="Meiryo UI" w:hint="eastAsia"/>
-                <w:sz w:val="16"/>
-                <w:szCs w:val="16"/>
-              </w:rPr>
-              <w:t>専用確認</w:t>
-            </w:r>
-            <w:proofErr w:type="spellEnd"/>
+              <w:t>D2 専用確認</w:t>
+            </w:r>
           </w:p>
         </w:tc>
         <w:tc>
@@ -3123,7 +2593,6 @@
                 <w:rFonts w:ascii="Meiryo UI" w:eastAsia="Meiryo UI" w:hAnsi="Meiryo UI"/>
               </w:rPr>
             </w:pPr>
-            <w:proofErr w:type="spellStart"/>
             <w:r>
               <w:rPr>
                 <w:rFonts w:ascii="Meiryo UI" w:eastAsia="Meiryo UI" w:hAnsi="Meiryo UI" w:hint="eastAsia"/>
@@ -3132,7 +2601,6 @@
               </w:rPr>
               <w:t>量産原則未使用</w:t>
             </w:r>
-            <w:proofErr w:type="spellEnd"/>
           </w:p>
         </w:tc>
       </w:tr>
@@ -3198,7 +2666,6 @@
                 <w:rFonts w:ascii="Meiryo UI" w:eastAsia="Meiryo UI" w:hAnsi="Meiryo UI"/>
               </w:rPr>
             </w:pPr>
-            <w:proofErr w:type="spellStart"/>
             <w:r>
               <w:rPr>
                 <w:rFonts w:ascii="Meiryo UI" w:eastAsia="Meiryo UI" w:hAnsi="Meiryo UI" w:hint="eastAsia"/>
@@ -3207,7 +2674,6 @@
               </w:rPr>
               <w:t>なし</w:t>
             </w:r>
-            <w:proofErr w:type="spellEnd"/>
           </w:p>
         </w:tc>
         <w:tc>
@@ -3268,7 +2734,6 @@
                 <w:rFonts w:ascii="Meiryo UI" w:eastAsia="Meiryo UI" w:hAnsi="Meiryo UI"/>
               </w:rPr>
             </w:pPr>
-            <w:proofErr w:type="spellStart"/>
             <w:r>
               <w:rPr>
                 <w:rFonts w:ascii="Meiryo UI" w:eastAsia="Meiryo UI" w:hAnsi="Meiryo UI" w:hint="eastAsia"/>
@@ -3277,7 +2742,6 @@
               </w:rPr>
               <w:t>なし</w:t>
             </w:r>
-            <w:proofErr w:type="spellEnd"/>
           </w:p>
         </w:tc>
         <w:tc>
@@ -3310,18 +2774,8 @@
                 <w:sz w:val="16"/>
                 <w:szCs w:val="16"/>
               </w:rPr>
-              <w:t xml:space="preserve">200 </w:t>
-            </w:r>
-            <w:proofErr w:type="spellStart"/>
-            <w:r>
-              <w:rPr>
-                <w:rFonts w:ascii="Meiryo UI" w:eastAsia="Meiryo UI" w:hAnsi="Meiryo UI" w:hint="eastAsia"/>
-                <w:sz w:val="16"/>
-                <w:szCs w:val="16"/>
-              </w:rPr>
-              <w:t>ms</w:t>
-            </w:r>
-            <w:proofErr w:type="spellEnd"/>
+              <w:t>200 ms</w:t>
+            </w:r>
           </w:p>
         </w:tc>
         <w:tc>
@@ -3348,7 +2802,6 @@
                 <w:rFonts w:ascii="Meiryo UI" w:eastAsia="Meiryo UI" w:hAnsi="Meiryo UI"/>
               </w:rPr>
             </w:pPr>
-            <w:proofErr w:type="spellStart"/>
             <w:r>
               <w:rPr>
                 <w:rFonts w:ascii="Meiryo UI" w:eastAsia="Meiryo UI" w:hAnsi="Meiryo UI" w:hint="eastAsia"/>
@@ -3357,7 +2810,6 @@
               </w:rPr>
               <w:t>あり</w:t>
             </w:r>
-            <w:proofErr w:type="spellEnd"/>
           </w:p>
         </w:tc>
         <w:tc>
@@ -3424,18 +2876,8 @@
                 <w:sz w:val="16"/>
                 <w:szCs w:val="16"/>
               </w:rPr>
-              <w:t xml:space="preserve">D3 </w:t>
-            </w:r>
-            <w:proofErr w:type="spellStart"/>
-            <w:r>
-              <w:rPr>
-                <w:rFonts w:ascii="Meiryo UI" w:eastAsia="Meiryo UI" w:hAnsi="Meiryo UI" w:hint="eastAsia"/>
-                <w:sz w:val="16"/>
-                <w:szCs w:val="16"/>
-              </w:rPr>
-              <w:t>専用確認</w:t>
-            </w:r>
-            <w:proofErr w:type="spellEnd"/>
+              <w:t>D3 専用確認</w:t>
+            </w:r>
           </w:p>
         </w:tc>
         <w:tc>
@@ -3468,18 +2910,8 @@
                 <w:sz w:val="16"/>
                 <w:szCs w:val="16"/>
               </w:rPr>
-              <w:t xml:space="preserve">LIFE_CALC clear </w:t>
-            </w:r>
-            <w:proofErr w:type="spellStart"/>
-            <w:r>
-              <w:rPr>
-                <w:rFonts w:ascii="Meiryo UI" w:eastAsia="Meiryo UI" w:hAnsi="Meiryo UI" w:hint="eastAsia"/>
-                <w:sz w:val="16"/>
-                <w:szCs w:val="16"/>
-              </w:rPr>
-              <w:t>副作用あり</w:t>
-            </w:r>
-            <w:proofErr w:type="spellEnd"/>
+              <w:t>LIFE_CALC clear 副作用あり</w:t>
+            </w:r>
           </w:p>
         </w:tc>
       </w:tr>
@@ -3545,7 +2977,6 @@
                 <w:rFonts w:ascii="Meiryo UI" w:eastAsia="Meiryo UI" w:hAnsi="Meiryo UI"/>
               </w:rPr>
             </w:pPr>
-            <w:proofErr w:type="spellStart"/>
             <w:r>
               <w:rPr>
                 <w:rFonts w:ascii="Meiryo UI" w:eastAsia="Meiryo UI" w:hAnsi="Meiryo UI" w:hint="eastAsia"/>
@@ -3554,7 +2985,6 @@
               </w:rPr>
               <w:t>なし</w:t>
             </w:r>
-            <w:proofErr w:type="spellEnd"/>
           </w:p>
         </w:tc>
         <w:tc>
@@ -3615,7 +3045,6 @@
                 <w:rFonts w:ascii="Meiryo UI" w:eastAsia="Meiryo UI" w:hAnsi="Meiryo UI"/>
               </w:rPr>
             </w:pPr>
-            <w:proofErr w:type="spellStart"/>
             <w:r>
               <w:rPr>
                 <w:rFonts w:ascii="Meiryo UI" w:eastAsia="Meiryo UI" w:hAnsi="Meiryo UI" w:hint="eastAsia"/>
@@ -3624,7 +3053,6 @@
               </w:rPr>
               <w:t>なし</w:t>
             </w:r>
-            <w:proofErr w:type="spellEnd"/>
           </w:p>
         </w:tc>
         <w:tc>
@@ -3657,18 +3085,8 @@
                 <w:sz w:val="16"/>
                 <w:szCs w:val="16"/>
               </w:rPr>
-              <w:t xml:space="preserve">100 </w:t>
-            </w:r>
-            <w:proofErr w:type="spellStart"/>
-            <w:r>
-              <w:rPr>
-                <w:rFonts w:ascii="Meiryo UI" w:eastAsia="Meiryo UI" w:hAnsi="Meiryo UI" w:hint="eastAsia"/>
-                <w:sz w:val="16"/>
-                <w:szCs w:val="16"/>
-              </w:rPr>
-              <w:t>ms</w:t>
-            </w:r>
-            <w:proofErr w:type="spellEnd"/>
+              <w:t>100 ms</w:t>
+            </w:r>
           </w:p>
         </w:tc>
         <w:tc>
@@ -3695,7 +3113,6 @@
                 <w:rFonts w:ascii="Meiryo UI" w:eastAsia="Meiryo UI" w:hAnsi="Meiryo UI"/>
               </w:rPr>
             </w:pPr>
-            <w:proofErr w:type="spellStart"/>
             <w:r>
               <w:rPr>
                 <w:rFonts w:ascii="Meiryo UI" w:eastAsia="Meiryo UI" w:hAnsi="Meiryo UI" w:hint="eastAsia"/>
@@ -3704,7 +3121,6 @@
               </w:rPr>
               <w:t>あり</w:t>
             </w:r>
-            <w:proofErr w:type="spellEnd"/>
           </w:p>
         </w:tc>
         <w:tc>
@@ -3771,18 +3187,8 @@
                 <w:sz w:val="16"/>
                 <w:szCs w:val="16"/>
               </w:rPr>
-              <w:t xml:space="preserve">D4 </w:t>
-            </w:r>
-            <w:proofErr w:type="spellStart"/>
-            <w:r>
-              <w:rPr>
-                <w:rFonts w:ascii="Meiryo UI" w:eastAsia="Meiryo UI" w:hAnsi="Meiryo UI" w:hint="eastAsia"/>
-                <w:sz w:val="16"/>
-                <w:szCs w:val="16"/>
-              </w:rPr>
-              <w:t>専用確認</w:t>
-            </w:r>
-            <w:proofErr w:type="spellEnd"/>
+              <w:t>D4 専用確認</w:t>
+            </w:r>
           </w:p>
         </w:tc>
         <w:tc>
@@ -3815,18 +3221,8 @@
                 <w:sz w:val="16"/>
                 <w:szCs w:val="16"/>
               </w:rPr>
-              <w:t xml:space="preserve">AC_FAIL_COUNT clear </w:t>
-            </w:r>
-            <w:proofErr w:type="spellStart"/>
-            <w:r>
-              <w:rPr>
-                <w:rFonts w:ascii="Meiryo UI" w:eastAsia="Meiryo UI" w:hAnsi="Meiryo UI" w:hint="eastAsia"/>
-                <w:sz w:val="16"/>
-                <w:szCs w:val="16"/>
-              </w:rPr>
-              <w:t>副作用あり</w:t>
-            </w:r>
-            <w:proofErr w:type="spellEnd"/>
+              <w:t>AC_FAIL_COUNT clear 副作用あり</w:t>
+            </w:r>
           </w:p>
         </w:tc>
       </w:tr>
@@ -3892,7 +3288,6 @@
                 <w:rFonts w:ascii="Meiryo UI" w:eastAsia="Meiryo UI" w:hAnsi="Meiryo UI"/>
               </w:rPr>
             </w:pPr>
-            <w:proofErr w:type="spellStart"/>
             <w:r>
               <w:rPr>
                 <w:rFonts w:ascii="Meiryo UI" w:eastAsia="Meiryo UI" w:hAnsi="Meiryo UI" w:hint="eastAsia"/>
@@ -3901,7 +3296,6 @@
               </w:rPr>
               <w:t>なし</w:t>
             </w:r>
-            <w:proofErr w:type="spellEnd"/>
           </w:p>
         </w:tc>
         <w:tc>
@@ -3962,7 +3356,6 @@
                 <w:rFonts w:ascii="Meiryo UI" w:eastAsia="Meiryo UI" w:hAnsi="Meiryo UI"/>
               </w:rPr>
             </w:pPr>
-            <w:proofErr w:type="spellStart"/>
             <w:r>
               <w:rPr>
                 <w:rFonts w:ascii="Meiryo UI" w:eastAsia="Meiryo UI" w:hAnsi="Meiryo UI" w:hint="eastAsia"/>
@@ -3971,7 +3364,6 @@
               </w:rPr>
               <w:t>なし</w:t>
             </w:r>
-            <w:proofErr w:type="spellEnd"/>
           </w:p>
         </w:tc>
         <w:tc>
@@ -4032,7 +3424,6 @@
                 <w:rFonts w:ascii="Meiryo UI" w:eastAsia="Meiryo UI" w:hAnsi="Meiryo UI"/>
               </w:rPr>
             </w:pPr>
-            <w:proofErr w:type="spellStart"/>
             <w:r>
               <w:rPr>
                 <w:rFonts w:ascii="Meiryo UI" w:eastAsia="Meiryo UI" w:hAnsi="Meiryo UI" w:hint="eastAsia"/>
@@ -4041,7 +3432,6 @@
               </w:rPr>
               <w:t>あり</w:t>
             </w:r>
-            <w:proofErr w:type="spellEnd"/>
           </w:p>
         </w:tc>
         <w:tc>
@@ -4142,18 +3532,8 @@
                 <w:sz w:val="16"/>
                 <w:szCs w:val="16"/>
               </w:rPr>
-              <w:t xml:space="preserve">OI-12: AR T2 final value </w:t>
-            </w:r>
-            <w:proofErr w:type="spellStart"/>
-            <w:r>
-              <w:rPr>
-                <w:rFonts w:ascii="Meiryo UI" w:eastAsia="Meiryo UI" w:hAnsi="Meiryo UI" w:hint="eastAsia"/>
-                <w:sz w:val="16"/>
-                <w:szCs w:val="16"/>
-              </w:rPr>
-              <w:t>未確定</w:t>
-            </w:r>
-            <w:proofErr w:type="spellEnd"/>
+              <w:t>OI-12: AR T2 final value 未確定</w:t>
+            </w:r>
           </w:p>
         </w:tc>
       </w:tr>
@@ -4185,7 +3565,6 @@
                 <w:rFonts w:ascii="Meiryo UI" w:eastAsia="Meiryo UI" w:hAnsi="Meiryo UI"/>
               </w:rPr>
             </w:pPr>
-            <w:proofErr w:type="spellStart"/>
             <w:r>
               <w:rPr>
                 <w:rFonts w:ascii="Meiryo UI" w:eastAsia="Meiryo UI" w:hAnsi="Meiryo UI" w:hint="eastAsia"/>
@@ -4194,7 +3573,6 @@
               </w:rPr>
               <w:t>FD_READ_xxxxxx</w:t>
             </w:r>
-            <w:proofErr w:type="spellEnd"/>
           </w:p>
         </w:tc>
         <w:tc>
@@ -4221,23 +3599,13 @@
                 <w:rFonts w:ascii="Meiryo UI" w:eastAsia="Meiryo UI" w:hAnsi="Meiryo UI"/>
               </w:rPr>
             </w:pPr>
-            <w:proofErr w:type="spellStart"/>
             <w:r>
               <w:rPr>
                 <w:rFonts w:ascii="Meiryo UI" w:eastAsia="Meiryo UI" w:hAnsi="Meiryo UI" w:hint="eastAsia"/>
                 <w:sz w:val="16"/>
                 <w:szCs w:val="16"/>
               </w:rPr>
-              <w:t>xxxxxx</w:t>
-            </w:r>
-            <w:proofErr w:type="spellEnd"/>
-            <w:r>
-              <w:rPr>
-                <w:rFonts w:ascii="Meiryo UI" w:eastAsia="Meiryo UI" w:hAnsi="Meiryo UI" w:hint="eastAsia"/>
-                <w:sz w:val="16"/>
-                <w:szCs w:val="16"/>
-              </w:rPr>
-              <w:t xml:space="preserve"> = 6 桁 HEX address</w:t>
+              <w:t>xxxxxx = 6 桁 HEX address</w:t>
             </w:r>
           </w:p>
         </w:tc>
@@ -4339,18 +3707,8 @@
                 <w:sz w:val="16"/>
                 <w:szCs w:val="16"/>
               </w:rPr>
-              <w:t xml:space="preserve">100 </w:t>
-            </w:r>
-            <w:proofErr w:type="spellStart"/>
-            <w:r>
-              <w:rPr>
-                <w:rFonts w:ascii="Meiryo UI" w:eastAsia="Meiryo UI" w:hAnsi="Meiryo UI" w:hint="eastAsia"/>
-                <w:sz w:val="16"/>
-                <w:szCs w:val="16"/>
-              </w:rPr>
-              <w:t>ms</w:t>
-            </w:r>
-            <w:proofErr w:type="spellEnd"/>
+              <w:t>100 ms</w:t>
+            </w:r>
           </w:p>
         </w:tc>
         <w:tc>
@@ -4377,7 +3735,6 @@
                 <w:rFonts w:ascii="Meiryo UI" w:eastAsia="Meiryo UI" w:hAnsi="Meiryo UI"/>
               </w:rPr>
             </w:pPr>
-            <w:proofErr w:type="spellStart"/>
             <w:r>
               <w:rPr>
                 <w:rFonts w:ascii="Meiryo UI" w:eastAsia="Meiryo UI" w:hAnsi="Meiryo UI" w:hint="eastAsia"/>
@@ -4386,7 +3743,6 @@
               </w:rPr>
               <w:t>あり</w:t>
             </w:r>
-            <w:proofErr w:type="spellEnd"/>
           </w:p>
         </w:tc>
         <w:tc>
@@ -4453,18 +3809,8 @@
                 <w:sz w:val="16"/>
                 <w:szCs w:val="16"/>
               </w:rPr>
-              <w:t xml:space="preserve">FD Query / raw </w:t>
-            </w:r>
-            <w:proofErr w:type="spellStart"/>
-            <w:r>
-              <w:rPr>
-                <w:rFonts w:ascii="Meiryo UI" w:eastAsia="Meiryo UI" w:hAnsi="Meiryo UI" w:hint="eastAsia"/>
-                <w:sz w:val="16"/>
-                <w:szCs w:val="16"/>
-              </w:rPr>
-              <w:t>参照</w:t>
-            </w:r>
-            <w:proofErr w:type="spellEnd"/>
+              <w:t>FD Query / raw 参照</w:t>
+            </w:r>
           </w:p>
         </w:tc>
         <w:tc>
@@ -4674,18 +4020,8 @@
                 <w:sz w:val="16"/>
                 <w:szCs w:val="16"/>
               </w:rPr>
-              <w:t xml:space="preserve">100 </w:t>
-            </w:r>
-            <w:proofErr w:type="spellStart"/>
-            <w:r>
-              <w:rPr>
-                <w:rFonts w:ascii="Meiryo UI" w:eastAsia="Meiryo UI" w:hAnsi="Meiryo UI" w:hint="eastAsia"/>
-                <w:sz w:val="16"/>
-                <w:szCs w:val="16"/>
-              </w:rPr>
-              <w:t>ms</w:t>
-            </w:r>
-            <w:proofErr w:type="spellEnd"/>
+              <w:t>100 ms</w:t>
+            </w:r>
           </w:p>
         </w:tc>
         <w:tc>
@@ -4712,7 +4048,6 @@
                 <w:rFonts w:ascii="Meiryo UI" w:eastAsia="Meiryo UI" w:hAnsi="Meiryo UI"/>
               </w:rPr>
             </w:pPr>
-            <w:proofErr w:type="spellStart"/>
             <w:r>
               <w:rPr>
                 <w:rFonts w:ascii="Meiryo UI" w:eastAsia="Meiryo UI" w:hAnsi="Meiryo UI" w:hint="eastAsia"/>
@@ -4721,7 +4056,6 @@
               </w:rPr>
               <w:t>あり</w:t>
             </w:r>
-            <w:proofErr w:type="spellEnd"/>
           </w:p>
         </w:tc>
         <w:tc>
@@ -4824,36 +4158,8 @@
                 <w:sz w:val="16"/>
                 <w:szCs w:val="16"/>
               </w:rPr>
-              <w:t>8 records/</w:t>
-            </w:r>
-            <w:proofErr w:type="spellStart"/>
-            <w:r>
-              <w:rPr>
-                <w:rFonts w:ascii="Meiryo UI" w:eastAsia="Meiryo UI" w:hAnsi="Meiryo UI" w:hint="eastAsia"/>
-                <w:sz w:val="16"/>
-                <w:szCs w:val="16"/>
-              </w:rPr>
-              <w:t>blockSTART_NO</w:t>
-            </w:r>
-            <w:proofErr w:type="spellEnd"/>
-            <w:r>
-              <w:rPr>
-                <w:rFonts w:ascii="Meiryo UI" w:eastAsia="Meiryo UI" w:hAnsi="Meiryo UI" w:hint="eastAsia"/>
-                <w:sz w:val="16"/>
-                <w:szCs w:val="16"/>
-              </w:rPr>
-              <w:t xml:space="preserve"> </w:t>
-            </w:r>
-            <w:proofErr w:type="spellStart"/>
-            <w:r>
-              <w:rPr>
-                <w:rFonts w:ascii="Meiryo UI" w:eastAsia="Meiryo UI" w:hAnsi="Meiryo UI" w:hint="eastAsia"/>
-                <w:sz w:val="16"/>
-                <w:szCs w:val="16"/>
-              </w:rPr>
-              <w:t>一致必須</w:t>
-            </w:r>
-            <w:proofErr w:type="spellEnd"/>
+              <w:t>8 records/blockSTART_NO 一致必須</w:t>
+            </w:r>
           </w:p>
         </w:tc>
       </w:tr>
@@ -5027,18 +4333,8 @@
                 <w:sz w:val="16"/>
                 <w:szCs w:val="16"/>
               </w:rPr>
-              <w:t xml:space="preserve">100 </w:t>
-            </w:r>
-            <w:proofErr w:type="spellStart"/>
-            <w:r>
-              <w:rPr>
-                <w:rFonts w:ascii="Meiryo UI" w:eastAsia="Meiryo UI" w:hAnsi="Meiryo UI" w:hint="eastAsia"/>
-                <w:sz w:val="16"/>
-                <w:szCs w:val="16"/>
-              </w:rPr>
-              <w:t>ms</w:t>
-            </w:r>
-            <w:proofErr w:type="spellEnd"/>
+              <w:t>100 ms</w:t>
+            </w:r>
           </w:p>
         </w:tc>
         <w:tc>
@@ -5065,7 +4361,6 @@
                 <w:rFonts w:ascii="Meiryo UI" w:eastAsia="Meiryo UI" w:hAnsi="Meiryo UI"/>
               </w:rPr>
             </w:pPr>
-            <w:proofErr w:type="spellStart"/>
             <w:r>
               <w:rPr>
                 <w:rFonts w:ascii="Meiryo UI" w:eastAsia="Meiryo UI" w:hAnsi="Meiryo UI" w:hint="eastAsia"/>
@@ -5074,7 +4369,6 @@
               </w:rPr>
               <w:t>あり</w:t>
             </w:r>
-            <w:proofErr w:type="spellEnd"/>
           </w:p>
         </w:tc>
         <w:tc>
@@ -5177,36 +4471,8 @@
                 <w:sz w:val="16"/>
                 <w:szCs w:val="16"/>
               </w:rPr>
-              <w:t>8 records/</w:t>
-            </w:r>
-            <w:proofErr w:type="spellStart"/>
-            <w:r>
-              <w:rPr>
-                <w:rFonts w:ascii="Meiryo UI" w:eastAsia="Meiryo UI" w:hAnsi="Meiryo UI" w:hint="eastAsia"/>
-                <w:sz w:val="16"/>
-                <w:szCs w:val="16"/>
-              </w:rPr>
-              <w:t>blockSTART_NO</w:t>
-            </w:r>
-            <w:proofErr w:type="spellEnd"/>
-            <w:r>
-              <w:rPr>
-                <w:rFonts w:ascii="Meiryo UI" w:eastAsia="Meiryo UI" w:hAnsi="Meiryo UI" w:hint="eastAsia"/>
-                <w:sz w:val="16"/>
-                <w:szCs w:val="16"/>
-              </w:rPr>
-              <w:t xml:space="preserve"> </w:t>
-            </w:r>
-            <w:proofErr w:type="spellStart"/>
-            <w:r>
-              <w:rPr>
-                <w:rFonts w:ascii="Meiryo UI" w:eastAsia="Meiryo UI" w:hAnsi="Meiryo UI" w:hint="eastAsia"/>
-                <w:sz w:val="16"/>
-                <w:szCs w:val="16"/>
-              </w:rPr>
-              <w:t>一致必須</w:t>
-            </w:r>
-            <w:proofErr w:type="spellEnd"/>
+              <w:t>8 records/blockSTART_NO 一致必須</w:t>
+            </w:r>
           </w:p>
         </w:tc>
       </w:tr>
@@ -5231,16 +4497,8 @@
         <w:rPr>
           <w:rFonts w:ascii="Meiryo UI" w:eastAsia="Meiryo UI" w:hAnsi="Meiryo UI" w:hint="eastAsia"/>
         </w:rPr>
-        <w:t xml:space="preserve">5. Control / Set / Clear </w:t>
+        <w:t>5. Control / Set / Clear コマンド</w:t>
       </w:r>
-      <w:proofErr w:type="spellStart"/>
-      <w:r>
-        <w:rPr>
-          <w:rFonts w:ascii="Meiryo UI" w:eastAsia="Meiryo UI" w:hAnsi="Meiryo UI" w:hint="eastAsia"/>
-        </w:rPr>
-        <w:t>コマンド</w:t>
-      </w:r>
-      <w:proofErr w:type="spellEnd"/>
     </w:p>
     <w:tbl>
       <w:tblPr>
@@ -5289,18 +4547,8 @@
                 <w:b/>
                 <w:sz w:val="16"/>
               </w:rPr>
-              <w:t xml:space="preserve">ATE </w:t>
-            </w:r>
-            <w:proofErr w:type="spellStart"/>
-            <w:r>
-              <w:rPr>
-                <w:rFonts w:ascii="Meiryo UI" w:eastAsia="Meiryo UI" w:hAnsi="Meiryo UI"/>
-                <w:b/>
-                <w:sz w:val="16"/>
-              </w:rPr>
-              <w:t>コマンド</w:t>
-            </w:r>
-            <w:proofErr w:type="spellEnd"/>
+              <w:t>ATE コマンド</w:t>
+            </w:r>
           </w:p>
         </w:tc>
         <w:tc>
@@ -5657,34 +4905,14 @@
                 <w:lang w:eastAsia="ja-JP"/>
               </w:rPr>
             </w:pPr>
-            <w:proofErr w:type="spellStart"/>
             <w:r>
               <w:rPr>
                 <w:rFonts w:ascii="Meiryo UI" w:eastAsia="Meiryo UI" w:hAnsi="Meiryo UI" w:hint="eastAsia"/>
                 <w:sz w:val="16"/>
                 <w:szCs w:val="16"/>
               </w:rPr>
-              <w:t>詳細</w:t>
-            </w:r>
-            <w:proofErr w:type="spellEnd"/>
-            <w:r>
-              <w:rPr>
-                <w:rFonts w:ascii="Meiryo UI" w:eastAsia="Meiryo UI" w:hAnsi="Meiryo UI" w:hint="eastAsia"/>
-                <w:sz w:val="16"/>
-                <w:szCs w:val="16"/>
-              </w:rPr>
-              <w:t xml:space="preserve"> item mapping </w:t>
-            </w:r>
-            <w:proofErr w:type="spellStart"/>
-            <w:r>
-              <w:rPr>
-                <w:rFonts w:ascii="Meiryo UI" w:eastAsia="Meiryo UI" w:hAnsi="Meiryo UI" w:hint="eastAsia"/>
-                <w:sz w:val="16"/>
-                <w:szCs w:val="16"/>
-              </w:rPr>
-              <w:t>は実装表と照合する</w:t>
-            </w:r>
-            <w:proofErr w:type="spellEnd"/>
+              <w:t>詳細 item mapping は実装表と照合する</w:t>
+            </w:r>
           </w:p>
         </w:tc>
       </w:tr>
@@ -5871,18 +5099,8 @@
                 <w:sz w:val="16"/>
                 <w:szCs w:val="16"/>
               </w:rPr>
-              <w:t xml:space="preserve">Parameter </w:t>
-            </w:r>
-            <w:proofErr w:type="spellStart"/>
-            <w:r>
-              <w:rPr>
-                <w:rFonts w:ascii="Meiryo UI" w:eastAsia="Meiryo UI" w:hAnsi="Meiryo UI" w:hint="eastAsia"/>
-                <w:sz w:val="16"/>
-                <w:szCs w:val="16"/>
-              </w:rPr>
-              <w:t>初期化</w:t>
-            </w:r>
-            <w:proofErr w:type="spellEnd"/>
+              <w:t>Parameter 初期化</w:t>
+            </w:r>
           </w:p>
         </w:tc>
       </w:tr>
@@ -6069,36 +5287,8 @@
                 <w:sz w:val="16"/>
                 <w:szCs w:val="16"/>
               </w:rPr>
-              <w:t xml:space="preserve">ERP </w:t>
-            </w:r>
-            <w:proofErr w:type="spellStart"/>
-            <w:r>
-              <w:rPr>
-                <w:rFonts w:ascii="Meiryo UI" w:eastAsia="Meiryo UI" w:hAnsi="Meiryo UI" w:hint="eastAsia"/>
-                <w:sz w:val="16"/>
-                <w:szCs w:val="16"/>
-              </w:rPr>
-              <w:t>設定形式は</w:t>
-            </w:r>
-            <w:proofErr w:type="spellEnd"/>
-            <w:r>
-              <w:rPr>
-                <w:rFonts w:ascii="Meiryo UI" w:eastAsia="Meiryo UI" w:hAnsi="Meiryo UI" w:hint="eastAsia"/>
-                <w:sz w:val="16"/>
-                <w:szCs w:val="16"/>
-              </w:rPr>
-              <w:t xml:space="preserve"> Command Master </w:t>
-            </w:r>
-            <w:proofErr w:type="spellStart"/>
-            <w:r>
-              <w:rPr>
-                <w:rFonts w:ascii="Meiryo UI" w:eastAsia="Meiryo UI" w:hAnsi="Meiryo UI" w:hint="eastAsia"/>
-                <w:sz w:val="16"/>
-                <w:szCs w:val="16"/>
-              </w:rPr>
-              <w:t>に従う</w:t>
-            </w:r>
-            <w:proofErr w:type="spellEnd"/>
+              <w:t>ERP 設定形式は Command Master に従う</w:t>
+            </w:r>
           </w:p>
         </w:tc>
       </w:tr>
@@ -6285,18 +5475,8 @@
                 <w:sz w:val="16"/>
                 <w:szCs w:val="16"/>
               </w:rPr>
-              <w:t xml:space="preserve">Pico-side RTC </w:t>
-            </w:r>
-            <w:proofErr w:type="spellStart"/>
-            <w:r>
-              <w:rPr>
-                <w:rFonts w:ascii="Meiryo UI" w:eastAsia="Meiryo UI" w:hAnsi="Meiryo UI" w:hint="eastAsia"/>
-                <w:sz w:val="16"/>
-                <w:szCs w:val="16"/>
-              </w:rPr>
-              <w:t>設定とは別</w:t>
-            </w:r>
-            <w:proofErr w:type="spellEnd"/>
+              <w:t>Pico-side RTC 設定とは別</w:t>
+            </w:r>
           </w:p>
         </w:tc>
       </w:tr>
@@ -6483,18 +5663,8 @@
                 <w:sz w:val="16"/>
                 <w:szCs w:val="16"/>
               </w:rPr>
-              <w:t xml:space="preserve">ASCII text は leading zero </w:t>
-            </w:r>
-            <w:proofErr w:type="spellStart"/>
-            <w:r>
-              <w:rPr>
-                <w:rFonts w:ascii="Meiryo UI" w:eastAsia="Meiryo UI" w:hAnsi="Meiryo UI" w:hint="eastAsia"/>
-                <w:sz w:val="16"/>
-                <w:szCs w:val="16"/>
-              </w:rPr>
-              <w:t>を保持</w:t>
-            </w:r>
-            <w:proofErr w:type="spellEnd"/>
+              <w:t>ASCII text は leading zero を保持</w:t>
+            </w:r>
           </w:p>
         </w:tc>
       </w:tr>
@@ -6681,18 +5851,8 @@
                 <w:sz w:val="16"/>
                 <w:szCs w:val="16"/>
               </w:rPr>
-              <w:t xml:space="preserve">OI-08: out-of-range PME behavior </w:t>
-            </w:r>
-            <w:proofErr w:type="spellStart"/>
-            <w:r>
-              <w:rPr>
-                <w:rFonts w:ascii="Meiryo UI" w:eastAsia="Meiryo UI" w:hAnsi="Meiryo UI" w:hint="eastAsia"/>
-                <w:sz w:val="16"/>
-                <w:szCs w:val="16"/>
-              </w:rPr>
-              <w:t>未確定</w:t>
-            </w:r>
-            <w:proofErr w:type="spellEnd"/>
+              <w:t>OI-08: out-of-range PME behavior 未確定</w:t>
+            </w:r>
           </w:p>
         </w:tc>
       </w:tr>
@@ -8651,41 +7811,13 @@
                 <w:lang w:eastAsia="ja-JP"/>
               </w:rPr>
             </w:pPr>
-            <w:proofErr w:type="spellStart"/>
             <w:r>
               <w:rPr>
                 <w:rFonts w:ascii="Meiryo UI" w:eastAsia="Meiryo UI" w:hAnsi="Meiryo UI" w:hint="eastAsia"/>
                 <w:sz w:val="16"/>
                 <w:szCs w:val="16"/>
               </w:rPr>
-              <w:t>積算</w:t>
-            </w:r>
-            <w:proofErr w:type="spellEnd"/>
-            <w:r>
-              <w:rPr>
-                <w:rFonts w:ascii="Meiryo UI" w:eastAsia="Meiryo UI" w:hAnsi="Meiryo UI" w:hint="eastAsia"/>
-                <w:sz w:val="16"/>
-                <w:szCs w:val="16"/>
-              </w:rPr>
-              <w:t>/</w:t>
-            </w:r>
-            <w:proofErr w:type="spellStart"/>
-            <w:r>
-              <w:rPr>
-                <w:rFonts w:ascii="Meiryo UI" w:eastAsia="Meiryo UI" w:hAnsi="Meiryo UI" w:hint="eastAsia"/>
-                <w:sz w:val="16"/>
-                <w:szCs w:val="16"/>
-              </w:rPr>
-              <w:t>状態</w:t>
-            </w:r>
-            <w:proofErr w:type="spellEnd"/>
-            <w:r>
-              <w:rPr>
-                <w:rFonts w:ascii="Meiryo UI" w:eastAsia="Meiryo UI" w:hAnsi="Meiryo UI" w:hint="eastAsia"/>
-                <w:sz w:val="16"/>
-                <w:szCs w:val="16"/>
-              </w:rPr>
-              <w:t xml:space="preserve"> clear 系</w:t>
+              <w:t>積算/状態 clear 系</w:t>
             </w:r>
           </w:p>
         </w:tc>
@@ -8867,23 +7999,13 @@
                 <w:lang w:eastAsia="ja-JP"/>
               </w:rPr>
             </w:pPr>
-            <w:proofErr w:type="spellStart"/>
             <w:r>
               <w:rPr>
                 <w:rFonts w:ascii="Meiryo UI" w:eastAsia="Meiryo UI" w:hAnsi="Meiryo UI" w:hint="eastAsia"/>
                 <w:sz w:val="16"/>
                 <w:szCs w:val="16"/>
               </w:rPr>
-              <w:t>電源系</w:t>
-            </w:r>
-            <w:proofErr w:type="spellEnd"/>
-            <w:r>
-              <w:rPr>
-                <w:rFonts w:ascii="Meiryo UI" w:eastAsia="Meiryo UI" w:hAnsi="Meiryo UI" w:hint="eastAsia"/>
-                <w:sz w:val="16"/>
-                <w:szCs w:val="16"/>
-              </w:rPr>
-              <w:t xml:space="preserve"> clear</w:t>
+              <w:t>電源系 clear</w:t>
             </w:r>
           </w:p>
         </w:tc>
@@ -9064,23 +8186,13 @@
                 <w:lang w:eastAsia="ja-JP"/>
               </w:rPr>
             </w:pPr>
-            <w:proofErr w:type="spellStart"/>
             <w:r>
               <w:rPr>
                 <w:rFonts w:ascii="Meiryo UI" w:eastAsia="Meiryo UI" w:hAnsi="Meiryo UI" w:hint="eastAsia"/>
                 <w:sz w:val="16"/>
                 <w:szCs w:val="16"/>
               </w:rPr>
-              <w:t>電池系</w:t>
-            </w:r>
-            <w:proofErr w:type="spellEnd"/>
-            <w:r>
-              <w:rPr>
-                <w:rFonts w:ascii="Meiryo UI" w:eastAsia="Meiryo UI" w:hAnsi="Meiryo UI" w:hint="eastAsia"/>
-                <w:sz w:val="16"/>
-                <w:szCs w:val="16"/>
-              </w:rPr>
-              <w:t xml:space="preserve"> clear</w:t>
+              <w:t>電池系 clear</w:t>
             </w:r>
           </w:p>
         </w:tc>
@@ -9454,18 +8566,8 @@
                 <w:sz w:val="16"/>
                 <w:szCs w:val="16"/>
               </w:rPr>
-              <w:t xml:space="preserve">OI-05, OI-12 </w:t>
-            </w:r>
-            <w:proofErr w:type="spellStart"/>
-            <w:r>
-              <w:rPr>
-                <w:rFonts w:ascii="Meiryo UI" w:eastAsia="Meiryo UI" w:hAnsi="Meiryo UI" w:hint="eastAsia"/>
-                <w:sz w:val="16"/>
-                <w:szCs w:val="16"/>
-              </w:rPr>
-              <w:t>関連</w:t>
-            </w:r>
-            <w:proofErr w:type="spellEnd"/>
+              <w:t>OI-05, OI-12 関連</w:t>
+            </w:r>
           </w:p>
         </w:tc>
       </w:tr>
@@ -9646,50 +8748,30 @@
                 <w:lang w:eastAsia="ja-JP"/>
               </w:rPr>
             </w:pPr>
-            <w:proofErr w:type="spellStart"/>
             <w:r>
               <w:rPr>
                 <w:rFonts w:ascii="Meiryo UI" w:eastAsia="Meiryo UI" w:hAnsi="Meiryo UI" w:hint="eastAsia"/>
                 <w:sz w:val="16"/>
                 <w:szCs w:val="16"/>
               </w:rPr>
-              <w:t>常に</w:t>
-            </w:r>
-            <w:proofErr w:type="spellEnd"/>
+              <w:t xml:space="preserve">常に </w:t>
+            </w:r>
+            <w:r>
+              <w:rPr>
+                <w:rFonts w:ascii="Meiryo UI" w:eastAsia="Meiryo UI" w:hAnsi="Meiryo UI"/>
+                <w:sz w:val="16"/>
+                <w:szCs w:val="16"/>
+              </w:rPr>
+              <w:t>ERR:FU_DISABLED</w:t>
+            </w:r>
             <w:r>
               <w:rPr>
                 <w:rFonts w:ascii="Meiryo UI" w:eastAsia="Meiryo UI" w:hAnsi="Meiryo UI" w:hint="eastAsia"/>
                 <w:sz w:val="16"/>
                 <w:szCs w:val="16"/>
               </w:rPr>
-              <w:t xml:space="preserve"> </w:t>
-            </w:r>
-            <w:r>
-              <w:rPr>
-                <w:rFonts w:ascii="Meiryo UI" w:eastAsia="Meiryo UI" w:hAnsi="Meiryo UI"/>
-                <w:sz w:val="16"/>
-                <w:szCs w:val="16"/>
-              </w:rPr>
-              <w:t>ERR:FU_DISABLED</w:t>
-            </w:r>
-            <w:r>
-              <w:rPr>
-                <w:rFonts w:ascii="Meiryo UI" w:eastAsia="Meiryo UI" w:hAnsi="Meiryo UI" w:hint="eastAsia"/>
-                <w:sz w:val="16"/>
-                <w:szCs w:val="16"/>
-              </w:rPr>
-              <w:t xml:space="preserve">NF55G </w:t>
-            </w:r>
-            <w:proofErr w:type="spellStart"/>
-            <w:r>
-              <w:rPr>
-                <w:rFonts w:ascii="Meiryo UI" w:eastAsia="Meiryo UI" w:hAnsi="Meiryo UI" w:hint="eastAsia"/>
-                <w:sz w:val="16"/>
-                <w:szCs w:val="16"/>
-              </w:rPr>
-              <w:t>へ送信しない</w:t>
-            </w:r>
-            <w:proofErr w:type="spellEnd"/>
+              <w:t>NF55G へ送信しない</w:t>
+            </w:r>
           </w:p>
         </w:tc>
       </w:tr>
@@ -9723,33 +8805,11 @@
           <w:rFonts w:ascii="Meiryo UI" w:eastAsia="Meiryo UI" w:hAnsi="Meiryo UI"/>
         </w:rPr>
       </w:pPr>
-      <w:proofErr w:type="spellStart"/>
       <w:r>
         <w:rPr>
           <w:rFonts w:ascii="Meiryo UI" w:eastAsia="Meiryo UI" w:hAnsi="Meiryo UI"/>
         </w:rPr>
-        <w:t>事前に</w:t>
-      </w:r>
-      <w:proofErr w:type="spellEnd"/>
-      <w:r>
-        <w:rPr>
-          <w:rFonts w:ascii="Meiryo UI" w:eastAsia="Meiryo UI" w:hAnsi="Meiryo UI"/>
-        </w:rPr>
-        <w:t xml:space="preserve"> DATA_REFRESH </w:t>
-      </w:r>
-      <w:proofErr w:type="spellStart"/>
-      <w:r>
-        <w:rPr>
-          <w:rFonts w:ascii="Meiryo UI" w:eastAsia="Meiryo UI" w:hAnsi="Meiryo UI"/>
-        </w:rPr>
-        <w:t>が成功していること。各</w:t>
-      </w:r>
-      <w:proofErr w:type="spellEnd"/>
-      <w:r>
-        <w:rPr>
-          <w:rFonts w:ascii="Meiryo UI" w:eastAsia="Meiryo UI" w:hAnsi="Meiryo UI"/>
-        </w:rPr>
-        <w:t xml:space="preserve"> Query は NF55G 通信を行わない。</w:t>
+        <w:t>事前に DATA_REFRESH が成功していること。各 Query は NF55G 通信を行わない。</w:t>
       </w:r>
     </w:p>
     <w:tbl>
@@ -9809,7 +8869,6 @@
                 <w:rFonts w:ascii="Meiryo UI" w:eastAsia="Meiryo UI" w:hAnsi="Meiryo UI"/>
               </w:rPr>
             </w:pPr>
-            <w:proofErr w:type="spellStart"/>
             <w:r>
               <w:rPr>
                 <w:rFonts w:ascii="Meiryo UI" w:eastAsia="Meiryo UI" w:hAnsi="Meiryo UI"/>
@@ -9818,7 +8877,6 @@
               </w:rPr>
               <w:t>応答形式</w:t>
             </w:r>
-            <w:proofErr w:type="spellEnd"/>
           </w:p>
         </w:tc>
         <w:tc>
@@ -9833,34 +8891,14 @@
                 <w:rFonts w:ascii="Meiryo UI" w:eastAsia="Meiryo UI" w:hAnsi="Meiryo UI"/>
               </w:rPr>
             </w:pPr>
-            <w:proofErr w:type="spellStart"/>
             <w:r>
               <w:rPr>
                 <w:rFonts w:ascii="Meiryo UI" w:eastAsia="Meiryo UI" w:hAnsi="Meiryo UI"/>
                 <w:b/>
                 <w:sz w:val="16"/>
               </w:rPr>
-              <w:t>単位</w:t>
-            </w:r>
-            <w:proofErr w:type="spellEnd"/>
-            <w:r>
-              <w:rPr>
-                <w:rFonts w:ascii="Meiryo UI" w:eastAsia="Meiryo UI" w:hAnsi="Meiryo UI"/>
-                <w:b/>
-                <w:sz w:val="16"/>
-              </w:rPr>
-              <w:t xml:space="preserve"> / </w:t>
-            </w:r>
-            <w:proofErr w:type="spellStart"/>
-            <w:r>
-              <w:rPr>
-                <w:rFonts w:ascii="Meiryo UI" w:eastAsia="Meiryo UI" w:hAnsi="Meiryo UI"/>
-                <w:b/>
-                <w:sz w:val="16"/>
-              </w:rPr>
-              <w:t>備考</w:t>
-            </w:r>
-            <w:proofErr w:type="spellEnd"/>
+              <w:t>単位 / 備考</w:t>
+            </w:r>
           </w:p>
         </w:tc>
       </w:tr>
@@ -10724,7 +9762,6 @@
                 <w:lang w:eastAsia="ja-JP"/>
               </w:rPr>
             </w:pPr>
-            <w:proofErr w:type="spellStart"/>
             <w:r>
               <w:rPr>
                 <w:rFonts w:ascii="Meiryo UI" w:eastAsia="Meiryo UI" w:hAnsi="Meiryo UI" w:hint="eastAsia"/>
@@ -10733,7 +9770,6 @@
               </w:rPr>
               <w:t>degC</w:t>
             </w:r>
-            <w:proofErr w:type="spellEnd"/>
           </w:p>
         </w:tc>
       </w:tr>
@@ -10793,7 +9829,6 @@
                 <w:lang w:eastAsia="ja-JP"/>
               </w:rPr>
             </w:pPr>
-            <w:proofErr w:type="spellStart"/>
             <w:r>
               <w:rPr>
                 <w:rFonts w:ascii="Meiryo UI" w:eastAsia="Meiryo UI" w:hAnsi="Meiryo UI" w:hint="eastAsia"/>
@@ -10802,7 +9837,6 @@
               </w:rPr>
               <w:t>degC</w:t>
             </w:r>
-            <w:proofErr w:type="spellEnd"/>
           </w:p>
         </w:tc>
       </w:tr>
@@ -11130,7 +10164,6 @@
                 <w:lang w:eastAsia="ja-JP"/>
               </w:rPr>
             </w:pPr>
-            <w:proofErr w:type="spellStart"/>
             <w:r>
               <w:rPr>
                 <w:rFonts w:ascii="Meiryo UI" w:eastAsia="Meiryo UI" w:hAnsi="Meiryo UI" w:hint="eastAsia"/>
@@ -11139,7 +10172,6 @@
               </w:rPr>
               <w:t>degC</w:t>
             </w:r>
-            <w:proofErr w:type="spellEnd"/>
           </w:p>
         </w:tc>
       </w:tr>
@@ -11266,7 +10298,6 @@
                 <w:lang w:eastAsia="ja-JP"/>
               </w:rPr>
             </w:pPr>
-            <w:proofErr w:type="spellStart"/>
             <w:r>
               <w:rPr>
                 <w:rFonts w:ascii="Meiryo UI" w:eastAsia="Meiryo UI" w:hAnsi="Meiryo UI" w:hint="eastAsia"/>
@@ -11275,7 +10306,6 @@
               </w:rPr>
               <w:t>degC</w:t>
             </w:r>
-            <w:proofErr w:type="spellEnd"/>
           </w:p>
         </w:tc>
       </w:tr>
@@ -11671,7 +10701,6 @@
                 <w:lang w:eastAsia="ja-JP"/>
               </w:rPr>
             </w:pPr>
-            <w:proofErr w:type="spellStart"/>
             <w:r>
               <w:rPr>
                 <w:rFonts w:ascii="Meiryo UI" w:eastAsia="Meiryo UI" w:hAnsi="Meiryo UI" w:hint="eastAsia"/>
@@ -11680,7 +10709,6 @@
               </w:rPr>
               <w:t>degC</w:t>
             </w:r>
-            <w:proofErr w:type="spellEnd"/>
           </w:p>
         </w:tc>
       </w:tr>
@@ -12616,7 +11644,6 @@
                 <w:lang w:eastAsia="ja-JP"/>
               </w:rPr>
             </w:pPr>
-            <w:proofErr w:type="spellStart"/>
             <w:r>
               <w:rPr>
                 <w:rFonts w:ascii="Meiryo UI" w:eastAsia="Meiryo UI" w:hAnsi="Meiryo UI" w:hint="eastAsia"/>
@@ -12625,7 +11652,6 @@
               </w:rPr>
               <w:t>degC</w:t>
             </w:r>
-            <w:proofErr w:type="spellEnd"/>
           </w:p>
         </w:tc>
       </w:tr>
@@ -12685,7 +11711,6 @@
                 <w:lang w:eastAsia="ja-JP"/>
               </w:rPr>
             </w:pPr>
-            <w:proofErr w:type="spellStart"/>
             <w:r>
               <w:rPr>
                 <w:rFonts w:ascii="Meiryo UI" w:eastAsia="Meiryo UI" w:hAnsi="Meiryo UI" w:hint="eastAsia"/>
@@ -12694,7 +11719,6 @@
               </w:rPr>
               <w:t>degC</w:t>
             </w:r>
-            <w:proofErr w:type="spellEnd"/>
           </w:p>
         </w:tc>
       </w:tr>
@@ -12754,7 +11778,6 @@
                 <w:lang w:eastAsia="ja-JP"/>
               </w:rPr>
             </w:pPr>
-            <w:proofErr w:type="spellStart"/>
             <w:r>
               <w:rPr>
                 <w:rFonts w:ascii="Meiryo UI" w:eastAsia="Meiryo UI" w:hAnsi="Meiryo UI" w:hint="eastAsia"/>
@@ -12763,7 +11786,6 @@
               </w:rPr>
               <w:t>degC</w:t>
             </w:r>
-            <w:proofErr w:type="spellEnd"/>
           </w:p>
         </w:tc>
       </w:tr>
@@ -12797,19 +11819,11 @@
           <w:rFonts w:ascii="Meiryo UI" w:eastAsia="Meiryo UI" w:hAnsi="Meiryo UI"/>
         </w:rPr>
       </w:pPr>
-      <w:proofErr w:type="spellStart"/>
       <w:r>
         <w:rPr>
           <w:rFonts w:ascii="Meiryo UI" w:eastAsia="Meiryo UI" w:hAnsi="Meiryo UI"/>
         </w:rPr>
-        <w:t>事前に</w:t>
-      </w:r>
-      <w:proofErr w:type="spellEnd"/>
-      <w:r>
-        <w:rPr>
-          <w:rFonts w:ascii="Meiryo UI" w:eastAsia="Meiryo UI" w:hAnsi="Meiryo UI"/>
-        </w:rPr>
-        <w:t xml:space="preserve"> STATUS_REFRESH </w:t>
+        <w:t xml:space="preserve">事前に STATUS_REFRESH </w:t>
       </w:r>
       <w:proofErr w:type="spellStart"/>
       <w:r>
@@ -16907,7 +15921,6 @@
                 <w:rFonts w:ascii="Meiryo UI" w:eastAsia="Meiryo UI" w:hAnsi="Meiryo UI"/>
               </w:rPr>
             </w:pPr>
-            <w:proofErr w:type="spellStart"/>
             <w:r>
               <w:rPr>
                 <w:rFonts w:ascii="Meiryo UI" w:eastAsia="Meiryo UI" w:hAnsi="Meiryo UI"/>
@@ -16915,7 +15928,6 @@
               </w:rPr>
               <w:t>degC</w:t>
             </w:r>
-            <w:proofErr w:type="spellEnd"/>
           </w:p>
         </w:tc>
       </w:tr>
@@ -16974,7 +15986,6 @@
                 <w:rFonts w:ascii="Meiryo UI" w:eastAsia="Meiryo UI" w:hAnsi="Meiryo UI"/>
               </w:rPr>
             </w:pPr>
-            <w:proofErr w:type="spellStart"/>
             <w:r>
               <w:rPr>
                 <w:rFonts w:ascii="Meiryo UI" w:eastAsia="Meiryo UI" w:hAnsi="Meiryo UI"/>
@@ -16982,7 +15993,6 @@
               </w:rPr>
               <w:t>degC</w:t>
             </w:r>
-            <w:proofErr w:type="spellEnd"/>
           </w:p>
         </w:tc>
       </w:tr>
@@ -17041,7 +16051,6 @@
                 <w:rFonts w:ascii="Meiryo UI" w:eastAsia="Meiryo UI" w:hAnsi="Meiryo UI"/>
               </w:rPr>
             </w:pPr>
-            <w:proofErr w:type="spellStart"/>
             <w:r>
               <w:rPr>
                 <w:rFonts w:ascii="Meiryo UI" w:eastAsia="Meiryo UI" w:hAnsi="Meiryo UI"/>
@@ -17049,7 +16058,6 @@
               </w:rPr>
               <w:t>degC</w:t>
             </w:r>
-            <w:proofErr w:type="spellEnd"/>
           </w:p>
         </w:tc>
       </w:tr>
@@ -17108,7 +16116,6 @@
                 <w:rFonts w:ascii="Meiryo UI" w:eastAsia="Meiryo UI" w:hAnsi="Meiryo UI"/>
               </w:rPr>
             </w:pPr>
-            <w:proofErr w:type="spellStart"/>
             <w:r>
               <w:rPr>
                 <w:rFonts w:ascii="Meiryo UI" w:eastAsia="Meiryo UI" w:hAnsi="Meiryo UI"/>
@@ -17116,7 +16123,6 @@
               </w:rPr>
               <w:t>degC</w:t>
             </w:r>
-            <w:proofErr w:type="spellEnd"/>
           </w:p>
         </w:tc>
       </w:tr>
@@ -17823,7 +16829,6 @@
                 <w:rFonts w:ascii="Meiryo UI" w:eastAsia="Meiryo UI" w:hAnsi="Meiryo UI"/>
               </w:rPr>
             </w:pPr>
-            <w:proofErr w:type="spellStart"/>
             <w:r>
               <w:rPr>
                 <w:rFonts w:ascii="Meiryo UI" w:eastAsia="Meiryo UI" w:hAnsi="Meiryo UI"/>
@@ -17831,7 +16836,6 @@
               </w:rPr>
               <w:t>degC</w:t>
             </w:r>
-            <w:proofErr w:type="spellEnd"/>
           </w:p>
         </w:tc>
       </w:tr>
@@ -18087,17 +17091,8 @@
                 <w:rFonts w:ascii="Meiryo UI" w:eastAsia="Meiryo UI" w:hAnsi="Meiryo UI"/>
                 <w:sz w:val="16"/>
               </w:rPr>
-              <w:t xml:space="preserve">OI-04: REF final wire format </w:t>
-            </w:r>
-            <w:proofErr w:type="spellStart"/>
-            <w:r>
-              <w:rPr>
-                <w:rFonts w:ascii="Meiryo UI" w:eastAsia="Meiryo UI" w:hAnsi="Meiryo UI"/>
-                <w:sz w:val="16"/>
-              </w:rPr>
-              <w:t>未確定</w:t>
-            </w:r>
-            <w:proofErr w:type="spellEnd"/>
+              <w:t>OI-04: REF final wire format 未確定</w:t>
+            </w:r>
           </w:p>
         </w:tc>
       </w:tr>
@@ -18181,17 +17176,8 @@
                 <w:rFonts w:ascii="Meiryo UI" w:eastAsia="Meiryo UI" w:hAnsi="Meiryo UI"/>
                 <w:sz w:val="16"/>
               </w:rPr>
-              <w:t xml:space="preserve">OI-04: REF final wire format </w:t>
-            </w:r>
-            <w:proofErr w:type="spellStart"/>
-            <w:r>
-              <w:rPr>
-                <w:rFonts w:ascii="Meiryo UI" w:eastAsia="Meiryo UI" w:hAnsi="Meiryo UI"/>
-                <w:sz w:val="16"/>
-              </w:rPr>
-              <w:t>未確定</w:t>
-            </w:r>
-            <w:proofErr w:type="spellEnd"/>
+              <w:t>OI-04: REF final wire format 未確定</w:t>
+            </w:r>
           </w:p>
         </w:tc>
       </w:tr>
@@ -18275,17 +17261,8 @@
                 <w:rFonts w:ascii="Meiryo UI" w:eastAsia="Meiryo UI" w:hAnsi="Meiryo UI"/>
                 <w:sz w:val="16"/>
               </w:rPr>
-              <w:t xml:space="preserve">OI-04: REF final wire format </w:t>
-            </w:r>
-            <w:proofErr w:type="spellStart"/>
-            <w:r>
-              <w:rPr>
-                <w:rFonts w:ascii="Meiryo UI" w:eastAsia="Meiryo UI" w:hAnsi="Meiryo UI"/>
-                <w:sz w:val="16"/>
-              </w:rPr>
-              <w:t>未確定</w:t>
-            </w:r>
-            <w:proofErr w:type="spellEnd"/>
+              <w:t>OI-04: REF final wire format 未確定</w:t>
+            </w:r>
           </w:p>
         </w:tc>
       </w:tr>
@@ -18369,17 +17346,8 @@
                 <w:rFonts w:ascii="Meiryo UI" w:eastAsia="Meiryo UI" w:hAnsi="Meiryo UI"/>
                 <w:sz w:val="16"/>
               </w:rPr>
-              <w:t xml:space="preserve">OI-04: REF final wire format </w:t>
-            </w:r>
-            <w:proofErr w:type="spellStart"/>
-            <w:r>
-              <w:rPr>
-                <w:rFonts w:ascii="Meiryo UI" w:eastAsia="Meiryo UI" w:hAnsi="Meiryo UI"/>
-                <w:sz w:val="16"/>
-              </w:rPr>
-              <w:t>未確定</w:t>
-            </w:r>
-            <w:proofErr w:type="spellEnd"/>
+              <w:t>OI-04: REF final wire format 未確定</w:t>
+            </w:r>
           </w:p>
         </w:tc>
       </w:tr>
@@ -18463,17 +17431,8 @@
                 <w:rFonts w:ascii="Meiryo UI" w:eastAsia="Meiryo UI" w:hAnsi="Meiryo UI"/>
                 <w:sz w:val="16"/>
               </w:rPr>
-              <w:t xml:space="preserve">OI-04: REF final wire format </w:t>
-            </w:r>
-            <w:proofErr w:type="spellStart"/>
-            <w:r>
-              <w:rPr>
-                <w:rFonts w:ascii="Meiryo UI" w:eastAsia="Meiryo UI" w:hAnsi="Meiryo UI"/>
-                <w:sz w:val="16"/>
-              </w:rPr>
-              <w:t>未確定</w:t>
-            </w:r>
-            <w:proofErr w:type="spellEnd"/>
+              <w:t>OI-04: REF final wire format 未確定</w:t>
+            </w:r>
           </w:p>
         </w:tc>
       </w:tr>
@@ -21085,7 +20044,6 @@
                 <w:rFonts w:ascii="Meiryo UI" w:eastAsia="Meiryo UI" w:hAnsi="Meiryo UI"/>
               </w:rPr>
             </w:pPr>
-            <w:proofErr w:type="spellStart"/>
             <w:r>
               <w:rPr>
                 <w:rFonts w:ascii="Meiryo UI" w:eastAsia="Meiryo UI" w:hAnsi="Meiryo UI"/>
@@ -21094,7 +20052,6 @@
               </w:rPr>
               <w:t>目的</w:t>
             </w:r>
-            <w:proofErr w:type="spellEnd"/>
           </w:p>
         </w:tc>
         <w:tc>

</xml_diff>